<commit_message>
100%: thesis backup, translation comments approved
</commit_message>
<xml_diff>
--- a/misc/Deniss Grabovskis 231RDB217.docx
+++ b/misc/Deniss Grabovskis 231RDB217.docx
@@ -7387,18 +7387,32 @@
         </w:drawing>
       </w:r>
     </w:p>
+    <w:commentRangeStart w:id="74"/>
     <w:p>
       <w:pPr>
         <w:pStyle w:val="Att-nos-ar-skaidrojumiem"/>
       </w:pPr>
-      <w:fldSimple w:instr=" STYLEREF  \s 1-līm-numurēts-virsraksts  \* MERGEFORMAT ">
-        <w:r>
-          <w:rPr>
-            <w:noProof/>
-          </w:rPr>
-          <w:t>3</w:t>
-        </w:r>
-      </w:fldSimple>
+      <w:r>
+        <w:fldChar w:fldCharType="begin"/>
+      </w:r>
+      <w:r>
+        <w:instrText xml:space="preserve"> STYLEREF  \s 1-līm-numurēts-virsraksts  \* MERGEFORMAT </w:instrText>
+      </w:r>
+      <w:r>
+        <w:fldChar w:fldCharType="separate"/>
+      </w:r>
+      <w:r>
+        <w:rPr>
+          <w:noProof/>
+        </w:rPr>
+        <w:t>3</w:t>
+      </w:r>
+      <w:r>
+        <w:rPr>
+          <w:noProof/>
+        </w:rPr>
+        <w:fldChar w:fldCharType="end"/>
+      </w:r>
       <w:r>
         <w:t>.</w:t>
       </w:r>
@@ -7425,50 +7439,6 @@
       </w:r>
       <w:r>
         <w:t xml:space="preserve"> Parsēšanas skripta blokshēma</w:t>
-      </w:r>
-    </w:p>
-    <w:p>
-      <w:pPr>
-        <w:pStyle w:val="1-lm-numurts-virsraksts"/>
-        <w:rPr>
-          <w:rFonts w:asciiTheme="minorHAnsi" w:hAnsiTheme="minorHAnsi"/>
-          <w:lang w:val="ru-RU"/>
-        </w:rPr>
-      </w:pPr>
-      <w:r>
-        <w:rPr>
-          <w:lang w:val="ru-RU"/>
-        </w:rPr>
-        <w:lastRenderedPageBreak/>
-        <w:t>Datu analīze</w:t>
-      </w:r>
-    </w:p>
-    <w:p>
-      <w:pPr>
-        <w:pStyle w:val="2-lm-virsraksts"/>
-        <w:rPr>
-          <w:rFonts w:asciiTheme="minorHAnsi" w:hAnsiTheme="minorHAnsi"/>
-        </w:rPr>
-      </w:pPr>
-      <w:r>
-        <w:t>Prognozēšanas datu kopas īss apraksts</w:t>
-      </w:r>
-    </w:p>
-    <w:p>
-      <w:pPr>
-        <w:pStyle w:val="Teksts"/>
-      </w:pPr>
-      <w:r>
-        <w:t>Kā parādīts iepriekšējās nodaļās, uzņēmuma avota dati tika parsēti no Excel failiem un pārveidoti strukturētā formā SQLite datubāzē.</w:t>
-      </w:r>
-    </w:p>
-    <w:p>
-      <w:pPr>
-        <w:pStyle w:val="Teksts"/>
-      </w:pPr>
-      <w:commentRangeStart w:id="74"/>
-      <w:r>
-        <w:t>Prognozēšanas uzdevumā pārdošanas tabula ir primāri interesanta, jo tā ir pamats mērķa mainīgā, kas saistīts ar pārdošanas apjomu, turpmākai veidošanai. Piegāžu tabulai tomēr ir papildu nozīme, jo piegādes var izmantot kā papildu ievades funkciju neironu tīkla pieejā, bet ne kā galveno prognozes objektu.</w:t>
       </w:r>
       <w:commentRangeEnd w:id="74"/>
       <w:r>
@@ -7478,6 +7448,59 @@
           <w:szCs w:val="24"/>
         </w:rPr>
         <w:commentReference w:id="74"/>
+      </w:r>
+    </w:p>
+    <w:p>
+      <w:pPr>
+        <w:pStyle w:val="1-lm-numurts-virsraksts"/>
+        <w:rPr>
+          <w:rFonts w:asciiTheme="minorHAnsi" w:hAnsiTheme="minorHAnsi"/>
+          <w:lang w:val="ru-RU"/>
+        </w:rPr>
+      </w:pPr>
+      <w:r>
+        <w:rPr>
+          <w:lang w:val="ru-RU"/>
+        </w:rPr>
+        <w:lastRenderedPageBreak/>
+        <w:t>Datu analīze</w:t>
+      </w:r>
+    </w:p>
+    <w:p>
+      <w:pPr>
+        <w:pStyle w:val="2-lm-virsraksts"/>
+        <w:rPr>
+          <w:rFonts w:asciiTheme="minorHAnsi" w:hAnsiTheme="minorHAnsi"/>
+        </w:rPr>
+      </w:pPr>
+      <w:r>
+        <w:t>Prognozēšanas datu kopas īss apraksts</w:t>
+      </w:r>
+    </w:p>
+    <w:p>
+      <w:pPr>
+        <w:pStyle w:val="Teksts"/>
+      </w:pPr>
+      <w:r>
+        <w:t>Kā parādīts iepriekšējās nodaļās, uzņēmuma avota dati tika parsēti no Excel failiem un pārveidoti strukturētā formā SQLite datubāzē.</w:t>
+      </w:r>
+    </w:p>
+    <w:p>
+      <w:pPr>
+        <w:pStyle w:val="Teksts"/>
+      </w:pPr>
+      <w:commentRangeStart w:id="75"/>
+      <w:r>
+        <w:t>Prognozēšanas uzdevumā pārdošanas tabula ir primāri interesanta, jo tā ir pamats mērķa mainīgā, kas saistīts ar pārdošanas apjomu, turpmākai veidošanai. Piegāžu tabulai tomēr ir papildu nozīme, jo piegādes var izmantot kā papildu ievades funkciju neironu tīkla pieejā, bet ne kā galveno prognozes objektu.</w:t>
+      </w:r>
+      <w:commentRangeEnd w:id="75"/>
+      <w:r>
+        <w:rPr>
+          <w:rStyle w:val="CommentReference"/>
+          <w:sz w:val="24"/>
+          <w:szCs w:val="24"/>
+        </w:rPr>
+        <w:commentReference w:id="75"/>
       </w:r>
     </w:p>
     <w:p>
@@ -7880,18 +7903,18 @@
         <w:pStyle w:val="Teksts"/>
         <w:spacing w:before="120"/>
       </w:pPr>
-      <w:commentRangeStart w:id="75"/>
+      <w:commentRangeStart w:id="76"/>
       <w:r>
         <w:t xml:space="preserve">Tādējādi </w:t>
       </w:r>
-      <w:commentRangeEnd w:id="75"/>
+      <w:commentRangeEnd w:id="76"/>
       <w:r>
         <w:rPr>
           <w:rStyle w:val="CommentReference"/>
           <w:sz w:val="24"/>
           <w:szCs w:val="24"/>
         </w:rPr>
-        <w:commentReference w:id="75"/>
+        <w:commentReference w:id="76"/>
       </w:r>
       <w:r>
         <w:t>šajā posmā var uzskatīt, ka sākotnējie dati jau ir pārveidoti analītiski piemērotā formā, un nākamais uzdevums ir novērtēt, cik lielā mērā šie dati ir piemēroti prognozējošo modeļu konstruēšanai.</w:t>
@@ -7909,34 +7932,34 @@
       <w:pPr>
         <w:pStyle w:val="Teksts"/>
       </w:pPr>
-      <w:commentRangeStart w:id="76"/>
+      <w:commentRangeStart w:id="77"/>
       <w:r>
         <w:t xml:space="preserve">Kā </w:t>
       </w:r>
-      <w:commentRangeEnd w:id="76"/>
+      <w:commentRangeEnd w:id="77"/>
       <w:r>
         <w:rPr>
           <w:rStyle w:val="CommentReference"/>
           <w:sz w:val="24"/>
           <w:szCs w:val="24"/>
         </w:rPr>
-        <w:commentReference w:id="76"/>
+        <w:commentReference w:id="77"/>
       </w:r>
       <w:r>
         <w:t xml:space="preserve">jau minēts iepriekš, pieejamie novērojumi aptver periodu no 2025. gada jūlija līdz </w:t>
       </w:r>
-      <w:commentRangeStart w:id="77"/>
+      <w:commentRangeStart w:id="78"/>
       <w:r>
         <w:t xml:space="preserve">2026. gada martam </w:t>
       </w:r>
-      <w:commentRangeEnd w:id="77"/>
+      <w:commentRangeEnd w:id="78"/>
       <w:r>
         <w:rPr>
           <w:rStyle w:val="CommentReference"/>
           <w:sz w:val="24"/>
           <w:szCs w:val="24"/>
         </w:rPr>
-        <w:commentReference w:id="77"/>
+        <w:commentReference w:id="78"/>
       </w:r>
       <w:r>
         <w:t>(ieskaitot). Tas nozīmē, ka ir pieejami tikai deviņu secīgu mēnešu novērojumi. Tas vien jau rada būtiskus ierobežojumus turpmākajai prognozēšanai, jo datos trūkst pat viena pilnīga gada cikla. Līdz ar to, pat ja pārdošanas paradumos ir sezonalitāte, to ir grūti pilnībā noteikt un pārbaudīt tik ilgā laika periodā.</w:t>
@@ -7946,19 +7969,19 @@
       <w:pPr>
         <w:pStyle w:val="Teksts"/>
       </w:pPr>
-      <w:commentRangeStart w:id="78"/>
+      <w:commentRangeStart w:id="79"/>
       <w:r>
         <w:lastRenderedPageBreak/>
         <w:t xml:space="preserve">Papildu </w:t>
       </w:r>
-      <w:commentRangeEnd w:id="78"/>
+      <w:commentRangeEnd w:id="79"/>
       <w:r>
         <w:rPr>
           <w:rStyle w:val="CommentReference"/>
           <w:sz w:val="24"/>
           <w:szCs w:val="24"/>
         </w:rPr>
-        <w:commentReference w:id="78"/>
+        <w:commentReference w:id="79"/>
       </w:r>
       <w:r>
         <w:t>sarežģījums ir tas, ka novērojumu bāze ir ne tikai īsa, bet arī tiek veidota pakāpeniski. Pirmajos grāmatvedības mēnešos dokumentēto materiālu saraksts turpināja paplašināties, kas nozīmē, ka daži produkti netika nekavējoties ievadīti sistēmā. Tāpēc agrīnās vērtības sērijā var atspoguļot ne tikai faktiskos pārdošanas apjomus, bet arī pašas grāmatvedības pilnīgumu. Tas nozīmē, ka zemāki pārdošanas apjomi sākumā (pirmajos mēnešos) ne vienmēr norāda uz tikpat zemu faktisko pieprasījumu.</w:t>
@@ -8002,7 +8025,7 @@
         </w:tabs>
         <w:jc w:val="left"/>
       </w:pPr>
-      <w:commentRangeStart w:id="79"/>
+      <w:commentRangeStart w:id="80"/>
       <w:r>
         <w:tab/>
       </w:r>
@@ -8047,14 +8070,14 @@
       <w:r>
         <w:t xml:space="preserve"> pa mēnešiem </w:t>
       </w:r>
-      <w:commentRangeEnd w:id="79"/>
+      <w:commentRangeEnd w:id="80"/>
       <w:r>
         <w:rPr>
           <w:rStyle w:val="CommentReference"/>
           <w:sz w:val="24"/>
           <w:szCs w:val="24"/>
         </w:rPr>
-        <w:commentReference w:id="79"/>
+        <w:commentReference w:id="80"/>
       </w:r>
     </w:p>
     <w:p>
@@ -8064,18 +8087,18 @@
       <w:r>
         <w:tab/>
       </w:r>
-      <w:commentRangeStart w:id="80"/>
+      <w:commentRangeStart w:id="81"/>
       <w:r>
         <w:t xml:space="preserve">Grafikā </w:t>
       </w:r>
-      <w:commentRangeEnd w:id="80"/>
+      <w:commentRangeEnd w:id="81"/>
       <w:r>
         <w:rPr>
           <w:rStyle w:val="CommentReference"/>
           <w:sz w:val="24"/>
           <w:szCs w:val="24"/>
         </w:rPr>
-        <w:commentReference w:id="80"/>
+        <w:commentReference w:id="81"/>
       </w:r>
       <w:r>
         <w:t>redzams, ka novērotais periods patiešām ir īss: laika ass attēlo tikai daļu no gada, un neatkārtojas tie paši otrā gada mēneši. Tas nozīmē, ka prognozei vajadzētu mazāk paļauties uz sezonalitāti, nekā sākotnēji pieņemts. Vienlaikus grafikā redzams, ka pirmajos mēnešos materiālu apjoms joprojām tika ģenerēts, kas nozīmē, ka agrīnie periodi jāvērtē piesardzīgi. Ir arī vērts atzīmēt, ka dokumentēto materiālu apjoms turpmākajos mēnešos samazinājās. Tas var būt saistīts ar dažādiem procesiem uzņēmumā, un teorētiski tam nevajadzētu ietekmēt prognozi, taču ir vērts to paturēt prātā.</w:t>
@@ -8085,18 +8108,18 @@
       <w:pPr>
         <w:pStyle w:val="Teksts"/>
       </w:pPr>
-      <w:commentRangeStart w:id="81"/>
+      <w:commentRangeStart w:id="82"/>
       <w:r>
         <w:t xml:space="preserve">Tas </w:t>
       </w:r>
-      <w:commentRangeEnd w:id="81"/>
+      <w:commentRangeEnd w:id="82"/>
       <w:r>
         <w:rPr>
           <w:rStyle w:val="CommentReference"/>
           <w:sz w:val="24"/>
           <w:szCs w:val="24"/>
         </w:rPr>
-        <w:commentReference w:id="81"/>
+        <w:commentReference w:id="82"/>
       </w:r>
       <w:r>
         <w:t>noved pie svarīga starpsecinājuma: pieejamie dati ir ierobežoti gan laika horizonta ilguma, gan agrīno novērojumu pilnīguma ziņā. Tas savukārt kļūst par vienu no galvenajiem argumentiem par labu plašākam prognožu apgabalam, nevis detalizētākam (individuālu datu līmenī).</w:t>
@@ -8118,18 +8141,18 @@
       <w:pPr>
         <w:pStyle w:val="Teksts"/>
       </w:pPr>
-      <w:commentRangeStart w:id="82"/>
+      <w:commentRangeStart w:id="83"/>
       <w:r>
         <w:t xml:space="preserve">No </w:t>
       </w:r>
-      <w:commentRangeEnd w:id="82"/>
+      <w:commentRangeEnd w:id="83"/>
       <w:r>
         <w:rPr>
           <w:rStyle w:val="CommentReference"/>
           <w:sz w:val="24"/>
           <w:szCs w:val="24"/>
         </w:rPr>
-        <w:commentReference w:id="82"/>
+        <w:commentReference w:id="83"/>
       </w:r>
       <w:r>
         <w:t>prognozēšanas viedokļa pārdošanas un piegādes datiem ir atšķirīga loma. Pārdošanas apjomi tieši atspoguļo faktisko pieprasījumu un tāpēc dabiski kļūst par prognozēšanas galveno uzmanības objektu. Savukārt piedāvājums raksturo krājumu papildināšanu un ir atkarīgs ne tikai no pieprasījuma, bet arī no iekšējiem lēmumiem un nezināmiem uzņēmuma procesiem.</w:t>
@@ -8139,18 +8162,18 @@
       <w:pPr>
         <w:pStyle w:val="Teksts"/>
       </w:pPr>
-      <w:commentRangeStart w:id="83"/>
+      <w:commentRangeStart w:id="84"/>
       <w:r>
         <w:t xml:space="preserve">Datubāzē </w:t>
       </w:r>
-      <w:commentRangeEnd w:id="83"/>
+      <w:commentRangeEnd w:id="84"/>
       <w:r>
         <w:rPr>
           <w:rStyle w:val="CommentReference"/>
           <w:sz w:val="24"/>
           <w:szCs w:val="24"/>
         </w:rPr>
-        <w:commentReference w:id="83"/>
+        <w:commentReference w:id="84"/>
       </w:r>
       <w:r>
         <w:t xml:space="preserve">ir arī skaidri nošķirti pārdošanas un pirkšanas apjomi: pārdošanas </w:t>
@@ -8172,7 +8195,7 @@
       <w:pPr>
         <w:pStyle w:val="Attls"/>
       </w:pPr>
-      <w:commentRangeStart w:id="84"/>
+      <w:commentRangeStart w:id="85"/>
       <w:r>
         <w:drawing>
           <wp:inline distT="0" distB="0" distL="0" distR="0" wp14:anchorId="6C140874" wp14:editId="16321784">
@@ -8194,14 +8217,14 @@
           </wp:inline>
         </w:drawing>
       </w:r>
-      <w:commentRangeEnd w:id="84"/>
+      <w:commentRangeEnd w:id="85"/>
       <w:r>
         <w:rPr>
           <w:rStyle w:val="CommentReference"/>
           <w:sz w:val="24"/>
           <w:szCs w:val="24"/>
         </w:rPr>
-        <w:commentReference w:id="84"/>
+        <w:commentReference w:id="85"/>
       </w:r>
     </w:p>
     <w:p>
@@ -8254,18 +8277,18 @@
       <w:pPr>
         <w:pStyle w:val="Teksts"/>
       </w:pPr>
-      <w:commentRangeStart w:id="85"/>
+      <w:commentRangeStart w:id="86"/>
       <w:r>
         <w:t xml:space="preserve">Šis </w:t>
       </w:r>
-      <w:commentRangeEnd w:id="85"/>
+      <w:commentRangeEnd w:id="86"/>
       <w:r>
         <w:rPr>
           <w:rStyle w:val="CommentReference"/>
           <w:sz w:val="24"/>
           <w:szCs w:val="24"/>
         </w:rPr>
-        <w:commentReference w:id="85"/>
+        <w:commentReference w:id="86"/>
       </w:r>
       <w:r>
         <w:t>novērojums ir īpaši svarīgs tradicionālajiem modeļiem. Tā kā piegādes veido tik īsu un nestabilu sēriju, tās nav piemērotas kā prognozējošs mainīgais. Neironu tīkla pieejā situācija ir citāda: pat retas piegādes var būt noderīgas kā papildu ievades signāls, ja modelis vienlaikus izmanto vairākas funkcijas. Tomēr pat šajā gadījumā piegādes nevajadzētu uzskatīt par atsevišķu prognozēšanas uzdevumu, bet gan par iespējamu papildu informāciju pārdošanas prognozēšanas modelim.</w:t>
@@ -8275,18 +8298,18 @@
       <w:pPr>
         <w:pStyle w:val="Teksts"/>
       </w:pPr>
-      <w:commentRangeStart w:id="86"/>
+      <w:commentRangeStart w:id="87"/>
       <w:r>
         <w:t xml:space="preserve">Tāpēc </w:t>
       </w:r>
-      <w:commentRangeEnd w:id="86"/>
+      <w:commentRangeEnd w:id="87"/>
       <w:r>
         <w:rPr>
           <w:rStyle w:val="CommentReference"/>
           <w:sz w:val="24"/>
           <w:szCs w:val="24"/>
         </w:rPr>
-        <w:commentReference w:id="86"/>
+        <w:commentReference w:id="87"/>
       </w:r>
       <w:r>
         <w:t>šajā darbā pārdošanas apjomi tiek uzskatīti par galveno prognozēšanas objektu, bet piegādes - par papildu kontekstu, ko var tālāk izmantot sarežģītos modeļos.</w:t>
@@ -8308,34 +8331,34 @@
       <w:pPr>
         <w:pStyle w:val="Teksts"/>
       </w:pPr>
-      <w:commentRangeStart w:id="87"/>
+      <w:commentRangeStart w:id="88"/>
       <w:r>
         <w:t xml:space="preserve">Nākamais </w:t>
       </w:r>
-      <w:commentRangeEnd w:id="87"/>
+      <w:commentRangeEnd w:id="88"/>
       <w:r>
         <w:rPr>
           <w:rStyle w:val="CommentReference"/>
           <w:sz w:val="24"/>
           <w:szCs w:val="24"/>
         </w:rPr>
-        <w:commentReference w:id="87"/>
+        <w:commentReference w:id="88"/>
       </w:r>
       <w:r>
         <w:t xml:space="preserve">svarīgais jautājums ir, kādā līmenī jāveido prognoze: atsevišķu materiālu līmenī vai lielāku produktu grupu līmenī. Formāli avota dati ļauj veidot laika rindu katram materiālam atsevišķi. Tomēr, analizējot pārdošanas apjomu sadalījumu pa mēnešiem, kļūst skaidrs, ka šāds detalizācijas līmenis vairumā gadījumu nav piemērots prognozēšanai: ievērojamai daļai materiālu pieejamā periodā nav pārdošanas vispār vai arī tie tiek pārdoti reti. 88 no 206 materiāliem datubāzē nav reģistrēts neviens pārdošanas mēnesis. </w:t>
       </w:r>
-      <w:commentRangeStart w:id="88"/>
+      <w:commentRangeStart w:id="89"/>
       <w:r>
         <w:t xml:space="preserve">Mediānais </w:t>
       </w:r>
-      <w:commentRangeEnd w:id="88"/>
+      <w:commentRangeEnd w:id="89"/>
       <w:r>
         <w:rPr>
           <w:rStyle w:val="CommentReference"/>
           <w:sz w:val="24"/>
           <w:szCs w:val="24"/>
         </w:rPr>
-        <w:commentReference w:id="88"/>
+        <w:commentReference w:id="89"/>
       </w:r>
       <w:r>
         <w:t>materiāls tiek pārdots tikai divos no deviņiem mēnešiem, kā redzams 4.5. attēlā. Tikai ļoti neliels skaits materiālu uzrāda pārdošanas apjomus lielākajā daļā pieejamo mēnešu. Izmantojot atsevišķus materiālus kā galveno prognozēšanas mērķi, modeļu salīdzinājumi tiktu veikti, izmantojot pārāk īsas un retas laika rindas.</w:t>
@@ -8371,18 +8394,18 @@
       <w:pPr>
         <w:pStyle w:val="Tab-virsraksts"/>
       </w:pPr>
-      <w:commentRangeStart w:id="89"/>
+      <w:commentRangeStart w:id="90"/>
       <w:r>
         <w:t>Materiālu sadalījums pēc pārdošanas mēnešu skaita</w:t>
       </w:r>
-      <w:commentRangeEnd w:id="89"/>
+      <w:commentRangeEnd w:id="90"/>
       <w:r>
         <w:rPr>
           <w:rStyle w:val="CommentReference"/>
           <w:sz w:val="24"/>
           <w:szCs w:val="24"/>
         </w:rPr>
-        <w:commentReference w:id="89"/>
+        <w:commentReference w:id="90"/>
       </w:r>
     </w:p>
     <w:tbl>
@@ -8722,7 +8745,7 @@
       <w:pPr>
         <w:pStyle w:val="Attls"/>
       </w:pPr>
-      <w:commentRangeStart w:id="90"/>
+      <w:commentRangeStart w:id="91"/>
       <w:r>
         <w:lastRenderedPageBreak/>
         <w:drawing>
@@ -8745,14 +8768,14 @@
           </wp:inline>
         </w:drawing>
       </w:r>
-      <w:commentRangeEnd w:id="90"/>
+      <w:commentRangeEnd w:id="91"/>
       <w:r>
         <w:rPr>
           <w:rStyle w:val="CommentReference"/>
           <w:sz w:val="24"/>
           <w:szCs w:val="24"/>
         </w:rPr>
-        <w:commentReference w:id="90"/>
+        <w:commentReference w:id="91"/>
       </w:r>
     </w:p>
     <w:p>
@@ -8809,18 +8832,18 @@
       <w:pPr>
         <w:pStyle w:val="Teksts"/>
       </w:pPr>
-      <w:commentRangeStart w:id="91"/>
+      <w:commentRangeStart w:id="92"/>
       <w:r>
         <w:t xml:space="preserve">Šādi </w:t>
       </w:r>
-      <w:commentRangeEnd w:id="91"/>
+      <w:commentRangeEnd w:id="92"/>
       <w:r>
         <w:rPr>
           <w:rStyle w:val="CommentReference"/>
           <w:sz w:val="24"/>
           <w:szCs w:val="24"/>
         </w:rPr>
-        <w:commentReference w:id="91"/>
+        <w:commentReference w:id="92"/>
       </w:r>
       <w:r>
         <w:t>dati ir neērti ne tikai tradicionālajām metodēm, bet pat salīdzināšanai. Ja prognoze ir balstīta uz individuāliem datiem, tradicionālās metodes tiks novērtētas, izmantojot ļoti retus, nestabilus datu kopumus. Šajā gadījumā salīdzināšanas rezultāts būs atkarīgs nevis no modeļa kvalitātes, bet gan no tā veiksmes trāpīt retam pārdošanas mēnesim. Tas padara secinājumus par metožu salīdzināšanu pārāk vājus.</w:t>
@@ -8830,18 +8853,18 @@
       <w:pPr>
         <w:pStyle w:val="Teksts"/>
       </w:pPr>
-      <w:commentRangeStart w:id="92"/>
+      <w:commentRangeStart w:id="93"/>
       <w:r>
         <w:t xml:space="preserve">Tāpēc </w:t>
       </w:r>
-      <w:commentRangeEnd w:id="92"/>
+      <w:commentRangeEnd w:id="93"/>
       <w:r>
         <w:rPr>
           <w:rStyle w:val="CommentReference"/>
           <w:sz w:val="24"/>
           <w:szCs w:val="24"/>
         </w:rPr>
-        <w:commentReference w:id="92"/>
+        <w:commentReference w:id="93"/>
       </w:r>
       <w:r>
         <w:t>galvenās problēmas formulējumam tika apsvērts plašāks apkopojuma līmenis — zīmola</w:t>
@@ -8889,18 +8912,18 @@
       <w:pPr>
         <w:pStyle w:val="Tab-virsraksts"/>
       </w:pPr>
-      <w:commentRangeStart w:id="93"/>
+      <w:commentRangeStart w:id="94"/>
       <w:r>
         <w:t>Zīmolu+kategoriju grupas un mēnešu skaits ar pārdošanas apjomiem, kas nav nulle</w:t>
       </w:r>
-      <w:commentRangeEnd w:id="93"/>
+      <w:commentRangeEnd w:id="94"/>
       <w:r>
         <w:rPr>
           <w:rStyle w:val="CommentReference"/>
           <w:sz w:val="24"/>
           <w:szCs w:val="24"/>
         </w:rPr>
-        <w:commentReference w:id="93"/>
+        <w:commentReference w:id="94"/>
       </w:r>
     </w:p>
     <w:tbl>
@@ -9561,34 +9584,34 @@
       <w:pPr>
         <w:pStyle w:val="Teksts"/>
       </w:pPr>
-      <w:commentRangeStart w:id="94"/>
+      <w:commentRangeStart w:id="95"/>
       <w:r>
         <w:t xml:space="preserve">Pēc </w:t>
       </w:r>
-      <w:commentRangeEnd w:id="94"/>
+      <w:commentRangeEnd w:id="95"/>
       <w:r>
         <w:rPr>
           <w:rStyle w:val="CommentReference"/>
           <w:sz w:val="24"/>
           <w:szCs w:val="24"/>
         </w:rPr>
-        <w:commentReference w:id="94"/>
+        <w:commentReference w:id="95"/>
       </w:r>
       <w:r>
         <w:t xml:space="preserve">šīs apkopošanas izrādījās, ka datos bija ierobežots, bet jau analīzei piemērots grupu skaits, kurās pārdošanas apjomi tika novēroti relatīvi regulāri. </w:t>
       </w:r>
-      <w:commentRangeStart w:id="95"/>
+      <w:commentRangeStart w:id="96"/>
       <w:r>
         <w:t>Tas padara zīmola+kategorijas līmeni piemērotāku primārajam prognozēšanas uzdevumam nekā atsevišķu produktu līmeni</w:t>
       </w:r>
-      <w:commentRangeEnd w:id="95"/>
+      <w:commentRangeEnd w:id="96"/>
       <w:r>
         <w:rPr>
           <w:rStyle w:val="CommentReference"/>
           <w:sz w:val="24"/>
           <w:szCs w:val="24"/>
         </w:rPr>
-        <w:commentReference w:id="95"/>
+        <w:commentReference w:id="96"/>
       </w:r>
       <w:r>
         <w:t>.</w:t>
@@ -9604,18 +9627,18 @@
       <w:pPr>
         <w:pStyle w:val="Teksts"/>
       </w:pPr>
-      <w:commentRangeStart w:id="96"/>
+      <w:commentRangeStart w:id="97"/>
       <w:r>
         <w:t xml:space="preserve">Tomēr </w:t>
       </w:r>
-      <w:commentRangeEnd w:id="96"/>
+      <w:commentRangeEnd w:id="97"/>
       <w:r>
         <w:rPr>
           <w:rStyle w:val="CommentReference"/>
           <w:sz w:val="24"/>
           <w:szCs w:val="24"/>
         </w:rPr>
-        <w:commentReference w:id="96"/>
+        <w:commentReference w:id="97"/>
       </w:r>
       <w:r>
         <w:t xml:space="preserve">pat </w:t>
@@ -9623,18 +9646,18 @@
       <w:r>
         <w:t xml:space="preserve">pēc pāriešanas uz zīmola+kategorijas līmeni ne visas grupas ir vienlīdz piemērotas prognozēšanai. Dažas grupas joprojām ir retas, izkaisītas un reti rada pārdošanas apjomus. Tāpēc turpmākai eksperimentēšanai ir nepieciešama papildu grupu atlase. Autors nolēma galvenajā eksperimentā iekļaut tikai tās zīmolu+kategoriju grupas, kurās pārdošanas apjomi tika novēroti lielākajā daļā pieejamo mēnešu. Tas nozīmē, ka sērijā jāiekļauj pārdošanas apjomi, kas nav nulle, </w:t>
       </w:r>
-      <w:commentRangeStart w:id="97"/>
+      <w:commentRangeStart w:id="98"/>
       <w:r>
         <w:t>vismaz sešos no deviņiem mēnešiem</w:t>
       </w:r>
-      <w:commentRangeEnd w:id="97"/>
+      <w:commentRangeEnd w:id="98"/>
       <w:r>
         <w:rPr>
           <w:rStyle w:val="CommentReference"/>
           <w:sz w:val="24"/>
           <w:szCs w:val="24"/>
         </w:rPr>
-        <w:commentReference w:id="97"/>
+        <w:commentReference w:id="98"/>
       </w:r>
       <w:r>
         <w:t>. Šis ierobežojums nav ieviests kā universāls noteikums, bet gan kā darba atlases kritērijs, kas balstīts uz datu struktūru. Praksē tas nozīmē, ka galvenajā eksperimentā tiek iekļautas tikai tās grupas, kurās pārdošanas apjomi tiek novēroti pietiekami regulāri, lai sērijā būtu vismaz minimāla pārdošanas dinamika</w:t>
@@ -9661,19 +9684,19 @@
       <w:pPr>
         <w:pStyle w:val="Teksts"/>
       </w:pPr>
-      <w:commentRangeStart w:id="98"/>
       <w:commentRangeStart w:id="99"/>
+      <w:commentRangeStart w:id="100"/>
       <w:r>
         <w:t xml:space="preserve">Primārais </w:t>
       </w:r>
-      <w:commentRangeEnd w:id="99"/>
+      <w:commentRangeEnd w:id="100"/>
       <w:r>
         <w:rPr>
           <w:rStyle w:val="CommentReference"/>
           <w:sz w:val="24"/>
           <w:szCs w:val="24"/>
         </w:rPr>
-        <w:commentReference w:id="99"/>
+        <w:commentReference w:id="100"/>
       </w:r>
       <w:r>
         <w:t xml:space="preserve">prognozes mainīgais ir </w:t>
@@ -9688,14 +9711,14 @@
       <w:r>
         <w:t xml:space="preserve"> </w:t>
       </w:r>
-      <w:commentRangeEnd w:id="98"/>
+      <w:commentRangeEnd w:id="99"/>
       <w:r>
         <w:rPr>
           <w:rStyle w:val="CommentReference"/>
           <w:sz w:val="24"/>
           <w:szCs w:val="24"/>
         </w:rPr>
-        <w:commentReference w:id="98"/>
+        <w:commentReference w:id="99"/>
       </w:r>
       <w:r>
         <w:t xml:space="preserve">— pārdošanas apjoms kubikmetros. Šo lēmumu nosaka uzņēmuma perspektīva: kokmateriālu iepirkumi tiek mērīti kubikmetros, kas nozīmē, ka tie ir jāprognozē. Ja prognozēšanas uzdevums ir saistīts ar nākamajam periodam nepieciešamo kokmateriālu daudzumu, tad prognoze kubikmetros būs nozīmīgāka. Lai gan tas var nešķist īpaši informatīvi </w:t>
@@ -9729,18 +9752,18 @@
       <w:pPr>
         <w:pStyle w:val="Teksts"/>
       </w:pPr>
-      <w:commentRangeStart w:id="100"/>
+      <w:commentRangeStart w:id="101"/>
       <w:r>
         <w:t xml:space="preserve">Šajā </w:t>
       </w:r>
-      <w:commentRangeEnd w:id="100"/>
+      <w:commentRangeEnd w:id="101"/>
       <w:r>
         <w:rPr>
           <w:rStyle w:val="CommentReference"/>
           <w:sz w:val="24"/>
           <w:szCs w:val="24"/>
         </w:rPr>
-        <w:commentReference w:id="100"/>
+        <w:commentReference w:id="101"/>
       </w:r>
       <w:r>
         <w:t>pētījumā sērijas konstruēšanai tiek izmantots mēneša solis. Katrai izvēlētajai zīmola+kategorijas grupai tiek ģenerēta vērtību secība mēnešiem no 2025. gada jūlija līdz 2026. gada martam. Ja attiecīgajā mēnesī konkrētajai grupai netiek reģistrēti pārdošanas apjomi, tiek pieņemts, ka tā ir nulle. Šis noteikums ir pieņemams tieši apkopotu grupu līmenī, jo mēnesis joprojām ir daļa no kopējā novērošanas perioda, vienkārši bez viena pārdošanas darījuma.</w:t>
@@ -10471,11 +10494,12 @@
           <w:lang w:val="ru-RU"/>
         </w:rPr>
       </w:pPr>
-      <w:commentRangeStart w:id="101"/>
+      <w:commentRangeStart w:id="102"/>
+      <w:commentRangeStart w:id="103"/>
       <w:r>
         <w:t>Laika rindu veidošana prognozēšanai</w:t>
       </w:r>
-      <w:commentRangeEnd w:id="101"/>
+      <w:commentRangeEnd w:id="103"/>
       <w:r>
         <w:rPr>
           <w:rStyle w:val="CommentReference"/>
@@ -10484,25 +10508,36 @@
           <w:szCs w:val="28"/>
           <w:lang w:val="ru-RU"/>
         </w:rPr>
-        <w:commentReference w:id="101"/>
+        <w:commentReference w:id="103"/>
+      </w:r>
+      <w:commentRangeEnd w:id="102"/>
+      <w:r>
+        <w:rPr>
+          <w:rStyle w:val="CommentReference"/>
+          <w:rFonts w:asciiTheme="minorHAnsi" w:hAnsiTheme="minorHAnsi"/>
+          <w:sz w:val="28"/>
+          <w:szCs w:val="28"/>
+          <w:lang w:val="ru-RU"/>
+        </w:rPr>
+        <w:commentReference w:id="102"/>
       </w:r>
     </w:p>
     <w:p>
       <w:pPr>
         <w:pStyle w:val="Teksts"/>
       </w:pPr>
-      <w:commentRangeStart w:id="102"/>
+      <w:commentRangeStart w:id="104"/>
       <w:r>
         <w:t xml:space="preserve">Atsevišķs </w:t>
       </w:r>
-      <w:commentRangeEnd w:id="102"/>
+      <w:commentRangeEnd w:id="104"/>
       <w:r>
         <w:rPr>
           <w:rStyle w:val="CommentReference"/>
           <w:sz w:val="24"/>
           <w:szCs w:val="24"/>
         </w:rPr>
-        <w:commentReference w:id="102"/>
+        <w:commentReference w:id="104"/>
       </w:r>
       <w:r>
         <w:t>jautājums ir par to, cik labi novērojumu pirmie mēneši atspoguļo faktisko pieprasījumu un cik lielā mērā to ietekmēja pakāpeniska pašas grāmatvedības datubāzes attīstība. Šim nolūkam ir lietderīgi salīdzināt divas vērtības: dokumentēto nozīmīgo materiālu skaitu un kopējo pārdošanas apjomu pa mēnešiem. Šo grafiku var</w:t>
@@ -10518,19 +10553,19 @@
       <w:pPr>
         <w:pStyle w:val="Teksts"/>
       </w:pPr>
-      <w:commentRangeStart w:id="103"/>
+      <w:commentRangeStart w:id="105"/>
       <w:r>
         <w:lastRenderedPageBreak/>
         <w:t xml:space="preserve">Tas </w:t>
       </w:r>
-      <w:commentRangeEnd w:id="103"/>
+      <w:commentRangeEnd w:id="105"/>
       <w:r>
         <w:rPr>
           <w:rStyle w:val="CommentReference"/>
           <w:sz w:val="24"/>
           <w:szCs w:val="24"/>
         </w:rPr>
-        <w:commentReference w:id="103"/>
+        <w:commentReference w:id="105"/>
       </w:r>
       <w:r>
         <w:t>apstiprina jau izdarīto secinājumu: pieejamos datus ierobežo ne tikai perioda ilgums, bet arī grāmatvedības uzskaites pilnīgums novērošanas perioda sākumā.</w:t>
@@ -10643,18 +10678,18 @@
       <w:r>
         <w:t xml:space="preserve">Ceturtkārt, pārdošanas apjomi </w:t>
       </w:r>
-      <w:commentRangeStart w:id="104"/>
+      <w:commentRangeStart w:id="106"/>
       <w:r>
         <w:t>tiks prognozēti vienu mēnesi uz priekšu</w:t>
       </w:r>
-      <w:commentRangeEnd w:id="104"/>
+      <w:commentRangeEnd w:id="106"/>
       <w:r>
         <w:rPr>
           <w:rStyle w:val="CommentReference"/>
           <w:sz w:val="24"/>
           <w:szCs w:val="24"/>
         </w:rPr>
-        <w:commentReference w:id="104"/>
+        <w:commentReference w:id="106"/>
       </w:r>
       <w:r>
         <w:t xml:space="preserve">. Ar deviņu mēnešu pieejamajiem datiem tas ir tehniski vispiemērotākais. Ilgāki prognozēšanas periodi būtu mazāk ticami ierobežotā datu apjoma dēļ. </w:t>
@@ -10667,34 +10702,34 @@
       <w:r>
         <w:t xml:space="preserve">Visbeidzot, turpmākā metožu salīdzināšana tiks balstīta uz tiem pašiem ievades datiem un to pašu mērķa mainīgo. Galvenie aplūkotie modeļi būs </w:t>
       </w:r>
-      <w:commentRangeStart w:id="105"/>
+      <w:commentRangeStart w:id="107"/>
       <w:r>
         <w:t>naivā prognozēšana</w:t>
       </w:r>
-      <w:commentRangeEnd w:id="105"/>
+      <w:commentRangeEnd w:id="107"/>
       <w:r>
         <w:rPr>
           <w:rStyle w:val="CommentReference"/>
           <w:sz w:val="24"/>
           <w:szCs w:val="24"/>
         </w:rPr>
-        <w:commentReference w:id="105"/>
+        <w:commentReference w:id="107"/>
       </w:r>
       <w:r>
         <w:t xml:space="preserve">, vienkāršā eksponenciālā izlīdzināšana, ARIMA un LSTM. </w:t>
       </w:r>
-      <w:commentRangeStart w:id="106"/>
+      <w:commentRangeStart w:id="108"/>
       <w:r>
         <w:t>Iekšējai kvalitātes novērtēšanai secīga validācija tiks veikta vēsturiskajos mēnešos, un galīgā validācija tiks veikta jaunākajā pieejamajā kontroles mēnesī.</w:t>
       </w:r>
-      <w:commentRangeEnd w:id="106"/>
+      <w:commentRangeEnd w:id="108"/>
       <w:r>
         <w:rPr>
           <w:rStyle w:val="CommentReference"/>
           <w:sz w:val="24"/>
           <w:szCs w:val="24"/>
         </w:rPr>
-        <w:commentReference w:id="106"/>
+        <w:commentReference w:id="108"/>
       </w:r>
     </w:p>
     <w:p>
@@ -10718,18 +10753,18 @@
       <w:pPr>
         <w:pStyle w:val="Teksts"/>
       </w:pPr>
-      <w:commentRangeStart w:id="107"/>
+      <w:commentRangeStart w:id="109"/>
       <w:r>
         <w:t xml:space="preserve">Lai </w:t>
       </w:r>
-      <w:commentRangeEnd w:id="107"/>
+      <w:commentRangeEnd w:id="109"/>
       <w:r>
         <w:rPr>
           <w:rStyle w:val="CommentReference"/>
           <w:sz w:val="24"/>
           <w:szCs w:val="24"/>
         </w:rPr>
-        <w:commentReference w:id="107"/>
+        <w:commentReference w:id="109"/>
       </w:r>
       <w:r>
         <w:t>nodrošinātu godīgu modeļa novērtējumu, apmācība vienmēr tiek veikta tikai ar iepriekšējiem datiem, un testēšana tiek veikta nākamajā mēnesī. Šajā modelī tiek izmantotas trīs validācijas kombinācijas:</w:t>
@@ -10763,18 +10798,18 @@
       <w:pPr>
         <w:pStyle w:val="Teksts"/>
       </w:pPr>
-      <w:commentRangeStart w:id="108"/>
+      <w:commentRangeStart w:id="110"/>
       <w:r>
         <w:t xml:space="preserve">Tādējādi </w:t>
       </w:r>
-      <w:commentRangeEnd w:id="108"/>
+      <w:commentRangeEnd w:id="110"/>
       <w:r>
         <w:rPr>
           <w:rStyle w:val="CommentReference"/>
           <w:sz w:val="24"/>
           <w:szCs w:val="24"/>
         </w:rPr>
-        <w:commentReference w:id="108"/>
+        <w:commentReference w:id="110"/>
       </w:r>
       <w:r>
         <w:t>katrā nākamajā eksperimentā tiek izmantots nedaudz vairāk apmācības datu un pārbaudīta nākamā mēneša prognoze. Tas ļauj iegūt vairākus konsekventus rezultātus un salīdzināt metožu robustumu, lai nodrošinātu to efektivitāti.</w:t>
@@ -10796,18 +10831,18 @@
       <w:pPr>
         <w:pStyle w:val="Teksts"/>
       </w:pPr>
-      <w:commentRangeStart w:id="109"/>
+      <w:commentRangeStart w:id="111"/>
       <w:r>
         <w:t xml:space="preserve">Naivās </w:t>
       </w:r>
-      <w:commentRangeEnd w:id="109"/>
+      <w:commentRangeEnd w:id="111"/>
       <w:r>
         <w:rPr>
           <w:rStyle w:val="CommentReference"/>
           <w:sz w:val="24"/>
           <w:szCs w:val="24"/>
         </w:rPr>
-        <w:commentReference w:id="109"/>
+        <w:commentReference w:id="111"/>
       </w:r>
       <w:r>
         <w:t>prognozes metode ir vienkāršākā prognozēšanas metode, kurā nākamā mēneša vērtība tiek pieņemta kā vienāda ar iepriekšējā mēneša vērtību. Formāli to var uzrakstīt šādi</w:t>
@@ -11178,18 +11213,18 @@
       <w:pPr>
         <w:pStyle w:val="Teksts"/>
       </w:pPr>
-      <w:commentRangeStart w:id="110"/>
+      <w:commentRangeStart w:id="112"/>
       <w:r>
         <w:t xml:space="preserve">Tas </w:t>
       </w:r>
-      <w:commentRangeEnd w:id="110"/>
+      <w:commentRangeEnd w:id="112"/>
       <w:r>
         <w:rPr>
           <w:rStyle w:val="CommentReference"/>
           <w:sz w:val="24"/>
           <w:szCs w:val="24"/>
         </w:rPr>
-        <w:commentReference w:id="110"/>
+        <w:commentReference w:id="112"/>
       </w:r>
       <w:r>
         <w:t>ir, prognozējot 2026. gada janvāri, tika izmantota 2025. gada decembra vērtība, prognozējot 2026. gada februāri, tika izmantota 2026. gada janvāra vērtība, un prognozējot 2026. gada martu, tika izmantota 2026. gada februāra vērtība.</w:t>
@@ -11199,18 +11234,18 @@
       <w:pPr>
         <w:pStyle w:val="Teksts"/>
       </w:pPr>
-      <w:commentRangeStart w:id="111"/>
+      <w:commentRangeStart w:id="113"/>
       <w:r>
         <w:t xml:space="preserve">Šajā </w:t>
       </w:r>
-      <w:commentRangeEnd w:id="111"/>
+      <w:commentRangeEnd w:id="113"/>
       <w:r>
         <w:rPr>
           <w:rStyle w:val="CommentReference"/>
           <w:sz w:val="24"/>
           <w:szCs w:val="24"/>
         </w:rPr>
-        <w:commentReference w:id="111"/>
+        <w:commentReference w:id="113"/>
       </w:r>
       <w:r>
         <w:t>darbā naivā prognoze tiek izmantota kā bāzes līnija salīdzināšanai ar citām metodēm. Ja sarežģītāks modelis nedarbojas labāk nekā vienkārši iepriekšējā mēneša vērtības pārnešana, tā praktisko priekšrocību dotajā datu kopā nevar uzskatīt par apstiprinātu.</w:t>
@@ -11218,18 +11253,18 @@
       <w:r>
         <w:t xml:space="preserve"> </w:t>
       </w:r>
-      <w:commentRangeStart w:id="112"/>
+      <w:commentRangeStart w:id="114"/>
       <w:r>
         <w:t xml:space="preserve">Sakritība </w:t>
       </w:r>
-      <w:commentRangeEnd w:id="112"/>
+      <w:commentRangeEnd w:id="114"/>
       <w:r>
         <w:rPr>
           <w:rStyle w:val="CommentReference"/>
           <w:sz w:val="24"/>
           <w:szCs w:val="24"/>
         </w:rPr>
-        <w:commentReference w:id="112"/>
+        <w:commentReference w:id="114"/>
       </w:r>
       <w:r>
         <w:t>starp sarežģītākā modeļa prognozi un naivo prognozi neti</w:t>
@@ -11982,18 +12017,18 @@
       <w:pPr>
         <w:pStyle w:val="Teksts"/>
       </w:pPr>
-      <w:commentRangeStart w:id="113"/>
+      <w:commentRangeStart w:id="115"/>
       <w:r>
         <w:t xml:space="preserve">Vienkāršā </w:t>
       </w:r>
-      <w:commentRangeEnd w:id="113"/>
+      <w:commentRangeEnd w:id="115"/>
       <w:r>
         <w:rPr>
           <w:rStyle w:val="CommentReference"/>
           <w:sz w:val="24"/>
           <w:szCs w:val="24"/>
         </w:rPr>
-        <w:commentReference w:id="113"/>
+        <w:commentReference w:id="115"/>
       </w:r>
       <w:r>
         <w:t>eksponenciālā izlīdzināšana ir tradicionāla laika rindu prognozēšanas metode, kurā nākamās vērtības prognoze tiek balstīta uz izlīdzinātu rindas līmeni, ņemot vērā iepriekšējos novērojumus. Atšķirībā no naivās prognozēšanas, šī metode balstās uz visām zināmajām rindas vērtībām (ieskaitot agrākās), pakāpeniski samazinot to ietekmi. Formāli metodi var uzrakstīt šādi:</w:t>
@@ -12356,18 +12391,18 @@
       <w:pPr>
         <w:pStyle w:val="Teksts"/>
       </w:pPr>
-      <w:commentRangeStart w:id="114"/>
+      <w:commentRangeStart w:id="116"/>
       <w:r>
         <w:t xml:space="preserve">Lai </w:t>
       </w:r>
-      <w:commentRangeEnd w:id="114"/>
+      <w:commentRangeEnd w:id="116"/>
       <w:r>
         <w:rPr>
           <w:rStyle w:val="CommentReference"/>
           <w:sz w:val="24"/>
           <w:szCs w:val="24"/>
         </w:rPr>
-        <w:commentReference w:id="114"/>
+        <w:commentReference w:id="116"/>
       </w:r>
       <w:r>
         <w:t>pielietotu metodi, dati tika iegūti no iepriekš apspriestās SQLite datubāzes. Šajā posmā kopējais pārdošanas apjoms (sale_m3) tika aprēķināts katrai zīmola+kategorijas grupai un katram mēnesim no 2025. gada jūlija līdz 2026. gada martam</w:t>
@@ -12396,18 +12431,18 @@
       <w:pPr>
         <w:pStyle w:val="Teksts"/>
       </w:pPr>
-      <w:commentRangeStart w:id="115"/>
+      <w:commentRangeStart w:id="117"/>
       <w:r>
         <w:t xml:space="preserve">Metode </w:t>
       </w:r>
-      <w:commentRangeEnd w:id="115"/>
+      <w:commentRangeEnd w:id="117"/>
       <w:r>
         <w:rPr>
           <w:rStyle w:val="CommentReference"/>
           <w:sz w:val="24"/>
           <w:szCs w:val="24"/>
         </w:rPr>
-        <w:commentReference w:id="115"/>
+        <w:commentReference w:id="117"/>
       </w:r>
       <w:r>
         <w:t xml:space="preserve">tika ieviesta Python valodā, izmantojot statsmodels bibliotēku, kurā vienkāršu eksponenciālu izlīdzināšanu attēlo SimpleExpSmoothing klase. Katrai grupai modelis tika apmācīts atsevišķi sērijas apmācības daļā. </w:t>
@@ -13054,18 +13089,18 @@
       <w:pPr>
         <w:pStyle w:val="Teksts"/>
       </w:pPr>
-      <w:commentRangeStart w:id="116"/>
+      <w:commentRangeStart w:id="118"/>
       <w:r>
         <w:t xml:space="preserve">ARIMA </w:t>
       </w:r>
-      <w:commentRangeEnd w:id="116"/>
+      <w:commentRangeEnd w:id="118"/>
       <w:r>
         <w:rPr>
           <w:rStyle w:val="CommentReference"/>
           <w:sz w:val="24"/>
           <w:szCs w:val="24"/>
         </w:rPr>
-        <w:commentReference w:id="116"/>
+        <w:commentReference w:id="118"/>
       </w:r>
       <w:r>
         <w:t>modeli definē trīs nenegatīvu veselu skaitļu parametri: p, d un q</w:t>
@@ -13156,19 +13191,19 @@
       <w:pPr>
         <w:pStyle w:val="Teksts"/>
       </w:pPr>
-      <w:commentRangeStart w:id="117"/>
+      <w:commentRangeStart w:id="119"/>
       <w:r>
         <w:lastRenderedPageBreak/>
         <w:t xml:space="preserve">Pareiza </w:t>
       </w:r>
-      <w:commentRangeEnd w:id="117"/>
+      <w:commentRangeEnd w:id="119"/>
       <w:r>
         <w:rPr>
           <w:rStyle w:val="CommentReference"/>
           <w:sz w:val="24"/>
           <w:szCs w:val="24"/>
         </w:rPr>
-        <w:commentReference w:id="117"/>
+        <w:commentReference w:id="119"/>
       </w:r>
       <w:r>
         <w:t>šo trīs parametru kombinācija sniegtu vislabāko modeļa prognozi. Tā kā pareizo ARIMA konfigurāciju nevar iepriekš zināt, katram koda testam tika pārbaudīts ierobežots p, d un q kandidātu kombināciju kopums, un tika izvēlēta labākā. Labākās konfigurācijas izvēlei tika izmantots AIC kritērijs. Tās standarta formu var uzrakstīt šādi</w:t>
@@ -13223,7 +13258,7 @@
         </w:rPr>
         <w:tab/>
       </w:r>
-      <w:bookmarkStart w:id="118" w:name="_Ref226990354"/>
+      <w:bookmarkStart w:id="120" w:name="_Ref226990354"/>
       <m:oMath>
         <m:r>
           <w:rPr>
@@ -13356,7 +13391,7 @@
       <w:r>
         <w:t>)</w:t>
       </w:r>
-      <w:bookmarkEnd w:id="118"/>
+      <w:bookmarkEnd w:id="120"/>
     </w:p>
     <w:p>
       <w:pPr>
@@ -13440,28 +13475,28 @@
       <w:pPr>
         <w:pStyle w:val="Teksts"/>
       </w:pPr>
-      <w:commentRangeStart w:id="119"/>
-      <w:commentRangeStart w:id="120"/>
+      <w:commentRangeStart w:id="121"/>
+      <w:commentRangeStart w:id="122"/>
       <w:r>
         <w:t xml:space="preserve">Kritērijs </w:t>
       </w:r>
-      <w:commentRangeEnd w:id="120"/>
+      <w:commentRangeEnd w:id="122"/>
       <w:r>
         <w:rPr>
           <w:rStyle w:val="CommentReference"/>
           <w:sz w:val="24"/>
           <w:szCs w:val="24"/>
         </w:rPr>
-        <w:commentReference w:id="120"/>
-      </w:r>
-      <w:commentRangeEnd w:id="119"/>
+        <w:commentReference w:id="122"/>
+      </w:r>
+      <w:commentRangeEnd w:id="121"/>
       <w:r>
         <w:rPr>
           <w:rStyle w:val="CommentReference"/>
           <w:sz w:val="24"/>
           <w:szCs w:val="24"/>
         </w:rPr>
-        <w:commentReference w:id="119"/>
+        <w:commentReference w:id="121"/>
       </w:r>
       <w:r>
         <w:t xml:space="preserve">tiek aprēķināts, pamatojoties uz </w:t>
@@ -13544,18 +13579,18 @@
       <w:r>
         <w:t xml:space="preserve">. </w:t>
       </w:r>
-      <w:commentRangeStart w:id="121"/>
+      <w:commentRangeStart w:id="123"/>
       <w:r>
         <w:t xml:space="preserve">Par to raksta </w:t>
       </w:r>
-      <w:commentRangeEnd w:id="121"/>
+      <w:commentRangeEnd w:id="123"/>
       <w:r>
         <w:rPr>
           <w:rStyle w:val="CommentReference"/>
           <w:sz w:val="24"/>
           <w:szCs w:val="24"/>
         </w:rPr>
-        <w:commentReference w:id="121"/>
+        <w:commentReference w:id="123"/>
       </w:r>
       <w:sdt>
         <w:sdtPr>
@@ -13601,18 +13636,18 @@
       <w:r>
         <w:t xml:space="preserve">. </w:t>
       </w:r>
-      <w:commentRangeStart w:id="122"/>
+      <w:commentRangeStart w:id="124"/>
       <w:r>
         <w:t xml:space="preserve">Līdz </w:t>
       </w:r>
-      <w:commentRangeEnd w:id="122"/>
+      <w:commentRangeEnd w:id="124"/>
       <w:r>
         <w:rPr>
           <w:rStyle w:val="CommentReference"/>
           <w:sz w:val="24"/>
           <w:szCs w:val="24"/>
         </w:rPr>
-        <w:commentReference w:id="122"/>
+        <w:commentReference w:id="124"/>
       </w:r>
       <w:r>
         <w:t>ar to k</w:t>
@@ -13639,18 +13674,18 @@
         </w:tabs>
         <w:jc w:val="left"/>
       </w:pPr>
-      <w:commentRangeStart w:id="123"/>
+      <w:commentRangeStart w:id="125"/>
       <w:r>
         <w:t xml:space="preserve">Sākotnējais </w:t>
       </w:r>
-      <w:commentRangeEnd w:id="123"/>
+      <w:commentRangeEnd w:id="125"/>
       <w:r>
         <w:rPr>
           <w:rStyle w:val="CommentReference"/>
           <w:sz w:val="24"/>
           <w:szCs w:val="24"/>
         </w:rPr>
-        <w:commentReference w:id="123"/>
+        <w:commentReference w:id="125"/>
       </w:r>
       <w:r>
         <w:t>kandidātu kombinācijas</w:t>
@@ -14510,18 +14545,18 @@
         </w:tabs>
         <w:jc w:val="left"/>
       </w:pPr>
-      <w:commentRangeStart w:id="124"/>
+      <w:commentRangeStart w:id="126"/>
       <w:r>
         <w:t xml:space="preserve">Implementācijai </w:t>
       </w:r>
-      <w:commentRangeEnd w:id="124"/>
+      <w:commentRangeEnd w:id="126"/>
       <w:r>
         <w:rPr>
           <w:rStyle w:val="CommentReference"/>
           <w:sz w:val="24"/>
           <w:szCs w:val="24"/>
         </w:rPr>
-        <w:commentReference w:id="124"/>
+        <w:commentReference w:id="126"/>
       </w:r>
       <w:r>
         <w:t>tika izmantota tā pati bibliotēka, kas tika izmantota vienkāršajai eksponenciālajai izlīdzināšanai, tāpēc pieeja un metodes palika nemainīgas; kods atšķīrās tikai noteiktos modeļa parametros. Veidojot ARIMA, papildus tika izmantoti parametri enforce_stationarity=False un enforce_invertibility=False. Pirmais parametrs atspējo stingro stacionaritātes prasību modeļa autoregresīvajai daļai, bet otrais atspējo stingro invertējamības prasību slīdošā vidējā daļai</w:t>
@@ -15251,18 +15286,18 @@
       <w:pPr>
         <w:pStyle w:val="2-lm-virsraksts"/>
       </w:pPr>
-      <w:commentRangeStart w:id="125"/>
+      <w:commentRangeStart w:id="127"/>
       <w:r>
         <w:t>LSTM neironu tīkls</w:t>
       </w:r>
-      <w:commentRangeEnd w:id="125"/>
+      <w:commentRangeEnd w:id="127"/>
       <w:r>
         <w:rPr>
           <w:rStyle w:val="CommentReference"/>
           <w:sz w:val="28"/>
           <w:szCs w:val="28"/>
         </w:rPr>
-        <w:commentReference w:id="125"/>
+        <w:commentReference w:id="127"/>
       </w:r>
     </w:p>
     <w:p>
@@ -15277,21 +15312,21 @@
       <w:pPr>
         <w:pStyle w:val="Teksts"/>
       </w:pPr>
-      <w:commentRangeStart w:id="126"/>
+      <w:commentRangeStart w:id="128"/>
       <w:r>
         <w:t>V</w:t>
       </w:r>
       <w:r>
         <w:t xml:space="preserve">ienvirziena </w:t>
       </w:r>
-      <w:commentRangeEnd w:id="126"/>
+      <w:commentRangeEnd w:id="128"/>
       <w:r>
         <w:rPr>
           <w:rStyle w:val="CommentReference"/>
           <w:sz w:val="24"/>
           <w:szCs w:val="24"/>
         </w:rPr>
-        <w:commentReference w:id="126"/>
+        <w:commentReference w:id="128"/>
       </w:r>
       <w:r>
         <w:t>neironu tīklu</w:t>
@@ -15299,18 +15334,22 @@
       <w:r>
         <w:t xml:space="preserve"> (</w:t>
       </w:r>
-      <w:commentRangeStart w:id="127"/>
-      <w:r>
+      <w:commentRangeStart w:id="129"/>
+      <w:r>
+        <w:rPr>
+          <w:i/>
+          <w:iCs/>
+        </w:rPr>
         <w:t>feedforward neural network</w:t>
       </w:r>
-      <w:commentRangeEnd w:id="127"/>
+      <w:commentRangeEnd w:id="129"/>
       <w:r>
         <w:rPr>
           <w:rStyle w:val="CommentReference"/>
           <w:sz w:val="24"/>
           <w:szCs w:val="24"/>
         </w:rPr>
-        <w:commentReference w:id="127"/>
+        <w:commentReference w:id="129"/>
       </w:r>
       <w:r>
         <w:t>)</w:t>
@@ -15417,7 +15456,7 @@
       <w:pPr>
         <w:pStyle w:val="Teksts"/>
       </w:pPr>
-      <w:commentRangeStart w:id="128"/>
+      <w:commentRangeStart w:id="130"/>
       <w:r>
         <w:t xml:space="preserve">Mākslīgs neirons pilnībā savienotā slānī aprēķina savu ieeju svērto summu ar pievienotu nobīdes terminu, kam seko nelineāras aktivācijas funkcijas pielietošana. Šo darbību var izteikt kā </w:t>
       </w:r>
@@ -15450,14 +15489,14 @@
       <w:r>
         <w:t>:</w:t>
       </w:r>
-      <w:commentRangeEnd w:id="128"/>
+      <w:commentRangeEnd w:id="130"/>
       <w:r>
         <w:rPr>
           <w:rStyle w:val="CommentReference"/>
           <w:sz w:val="24"/>
           <w:szCs w:val="24"/>
         </w:rPr>
-        <w:commentReference w:id="128"/>
+        <w:commentReference w:id="130"/>
       </w:r>
     </w:p>
     <w:p>
@@ -15723,18 +15762,18 @@
       <w:pPr>
         <w:pStyle w:val="Teksts"/>
       </w:pPr>
-      <w:commentRangeStart w:id="129"/>
+      <w:commentRangeStart w:id="131"/>
       <w:r>
         <w:t>Slānim</w:t>
       </w:r>
-      <w:commentRangeEnd w:id="129"/>
+      <w:commentRangeEnd w:id="131"/>
       <w:r>
         <w:rPr>
           <w:rStyle w:val="CommentReference"/>
           <w:sz w:val="24"/>
           <w:szCs w:val="24"/>
         </w:rPr>
-        <w:commentReference w:id="129"/>
+        <w:commentReference w:id="131"/>
       </w:r>
       <w:r>
         <w:t xml:space="preserve">, kas sastāv no vairākiem neironiem, šo aprēķinu </w:t>
@@ -15748,18 +15787,18 @@
       <w:r>
         <w:t xml:space="preserve">. </w:t>
       </w:r>
-      <w:commentRangeStart w:id="130"/>
+      <w:commentRangeStart w:id="132"/>
       <w:r>
         <w:t xml:space="preserve">Daudzslāņu </w:t>
       </w:r>
-      <w:commentRangeEnd w:id="130"/>
+      <w:commentRangeEnd w:id="132"/>
       <w:r>
         <w:rPr>
           <w:rStyle w:val="CommentReference"/>
           <w:sz w:val="24"/>
           <w:szCs w:val="24"/>
         </w:rPr>
-        <w:commentReference w:id="130"/>
+        <w:commentReference w:id="132"/>
       </w:r>
       <w:r>
         <w:t xml:space="preserve">perceptronos neironi ir organizēti ieejas, slēptajā un izejas slāņos, un tīkls mācās, pielāgojot svarus, lai samazinātu kļūdu starp prognozēto un vēlamo izejas vērtību </w:t>
@@ -17478,7 +17517,7 @@
       <w:r>
         <w:t xml:space="preserve"> </w:t>
       </w:r>
-      <w:commentRangeStart w:id="131"/>
+      <w:commentRangeStart w:id="133"/>
       <w:sdt>
         <w:sdtPr>
           <w:id w:val="1445189478"/>
@@ -17587,14 +17626,14 @@
           </w:r>
         </w:sdtContent>
       </w:sdt>
-      <w:commentRangeEnd w:id="131"/>
+      <w:commentRangeEnd w:id="133"/>
       <w:r>
         <w:rPr>
           <w:rStyle w:val="CommentReference"/>
           <w:sz w:val="24"/>
           <w:szCs w:val="24"/>
         </w:rPr>
-        <w:commentReference w:id="131"/>
+        <w:commentReference w:id="133"/>
       </w:r>
       <w:r>
         <w:t xml:space="preserve"> </w:t>
@@ -18434,21 +18473,21 @@
       <w:r>
         <w:t xml:space="preserve">Praktiski standartizācija padara </w:t>
       </w:r>
-      <w:commentRangeStart w:id="132"/>
+      <w:commentRangeStart w:id="134"/>
       <w:r>
         <w:t>ie</w:t>
       </w:r>
       <w:r>
         <w:t xml:space="preserve">zīmju </w:t>
       </w:r>
-      <w:commentRangeEnd w:id="132"/>
+      <w:commentRangeEnd w:id="134"/>
       <w:r>
         <w:rPr>
           <w:rStyle w:val="CommentReference"/>
           <w:sz w:val="24"/>
           <w:szCs w:val="24"/>
         </w:rPr>
-        <w:commentReference w:id="132"/>
+        <w:commentReference w:id="134"/>
       </w:r>
       <w:r>
         <w:t xml:space="preserve">skalas salīdzināmas, palīdz nodrošināt, ka </w:t>
@@ -18806,18 +18845,18 @@
       <w:r>
         <w:t xml:space="preserve">. </w:t>
       </w:r>
-      <w:commentRangeStart w:id="133"/>
+      <w:commentRangeStart w:id="135"/>
       <w:r>
         <w:t>To teorētiski varētu izmantot šī darba</w:t>
       </w:r>
-      <w:commentRangeEnd w:id="133"/>
+      <w:commentRangeEnd w:id="135"/>
       <w:r>
         <w:rPr>
           <w:rStyle w:val="CommentReference"/>
           <w:sz w:val="24"/>
           <w:szCs w:val="24"/>
         </w:rPr>
-        <w:commentReference w:id="133"/>
+        <w:commentReference w:id="135"/>
       </w:r>
       <w:r>
         <w:t>.</w:t>
@@ -18830,18 +18869,18 @@
           <w:lang w:val="ru-RU"/>
         </w:rPr>
       </w:pPr>
-      <w:commentRangeStart w:id="134"/>
+      <w:commentRangeStart w:id="136"/>
       <w:r>
         <w:t xml:space="preserve">Rekurenti </w:t>
       </w:r>
-      <w:commentRangeEnd w:id="134"/>
+      <w:commentRangeEnd w:id="136"/>
       <w:r>
         <w:rPr>
           <w:rStyle w:val="CommentReference"/>
           <w:sz w:val="24"/>
           <w:szCs w:val="24"/>
         </w:rPr>
-        <w:commentReference w:id="134"/>
+        <w:commentReference w:id="136"/>
       </w:r>
       <w:r>
         <w:t>tīkli un LSTM atšķirība</w:t>
@@ -19743,31 +19782,31 @@
       <w:pPr>
         <w:pStyle w:val="3-lm-virsraksts"/>
       </w:pPr>
-      <w:commentRangeStart w:id="135"/>
-      <w:commentRangeStart w:id="136"/>
+      <w:commentRangeStart w:id="137"/>
+      <w:commentRangeStart w:id="138"/>
       <w:r>
         <w:t xml:space="preserve">Datu </w:t>
       </w:r>
-      <w:commentRangeEnd w:id="136"/>
+      <w:commentRangeEnd w:id="138"/>
       <w:r>
         <w:rPr>
           <w:rStyle w:val="CommentReference"/>
           <w:sz w:val="24"/>
           <w:szCs w:val="24"/>
         </w:rPr>
-        <w:commentReference w:id="136"/>
+        <w:commentReference w:id="138"/>
       </w:r>
       <w:r>
         <w:t>sagatavošana</w:t>
       </w:r>
-      <w:commentRangeEnd w:id="135"/>
+      <w:commentRangeEnd w:id="137"/>
       <w:r>
         <w:rPr>
           <w:rStyle w:val="CommentReference"/>
           <w:sz w:val="24"/>
           <w:szCs w:val="24"/>
         </w:rPr>
-        <w:commentReference w:id="135"/>
+        <w:commentReference w:id="137"/>
       </w:r>
     </w:p>
     <w:p>
@@ -20225,18 +20264,18 @@
       <w:pPr>
         <w:pStyle w:val="Teksts"/>
       </w:pPr>
-      <w:commentRangeStart w:id="137"/>
+      <w:commentRangeStart w:id="139"/>
       <w:r>
         <w:t xml:space="preserve">Eksperimentā </w:t>
       </w:r>
-      <w:commentRangeEnd w:id="137"/>
+      <w:commentRangeEnd w:id="139"/>
       <w:r>
         <w:rPr>
           <w:rStyle w:val="CommentReference"/>
           <w:sz w:val="24"/>
           <w:szCs w:val="24"/>
         </w:rPr>
-        <w:commentReference w:id="137"/>
+        <w:commentReference w:id="139"/>
       </w:r>
       <w:r>
         <w:t xml:space="preserve">viens LSTM modelis tiek apmācīts uz kopīga logu kopas, kas savākta no visām grupām. To var redzēt </w:t>
@@ -20978,19 +21017,19 @@
       <w:pPr>
         <w:pStyle w:val="Teksts"/>
       </w:pPr>
-      <w:commentRangeStart w:id="138"/>
+      <w:commentRangeStart w:id="140"/>
       <w:r>
         <w:lastRenderedPageBreak/>
         <w:t xml:space="preserve">Apmācība </w:t>
       </w:r>
-      <w:commentRangeEnd w:id="138"/>
+      <w:commentRangeEnd w:id="140"/>
       <w:r>
         <w:rPr>
           <w:rStyle w:val="CommentReference"/>
           <w:sz w:val="24"/>
           <w:szCs w:val="24"/>
         </w:rPr>
-        <w:commentReference w:id="138"/>
+        <w:commentReference w:id="140"/>
       </w:r>
       <w:r>
         <w:t xml:space="preserve">notiek, izmantojot </w:t>
@@ -22039,18 +22078,18 @@
       <w:pPr>
         <w:pStyle w:val="Teksts"/>
       </w:pPr>
-      <w:commentRangeStart w:id="139"/>
+      <w:commentRangeStart w:id="141"/>
       <w:r>
         <w:t xml:space="preserve">Kā </w:t>
       </w:r>
-      <w:commentRangeEnd w:id="139"/>
+      <w:commentRangeEnd w:id="141"/>
       <w:r>
         <w:rPr>
           <w:rStyle w:val="CommentReference"/>
           <w:sz w:val="24"/>
           <w:szCs w:val="24"/>
         </w:rPr>
-        <w:commentReference w:id="139"/>
+        <w:commentReference w:id="141"/>
       </w:r>
       <w:r>
         <w:t>minēts iepriekš, modeļi tika novērtēti trīs atsevišķos mēnešos katrai materiālu grupai, kā rezultātā katram modelim tika iegūta 21 prognoze. Absolūtā procentuālā kļūda (absolūtā starpība starp faktisko un prognozēto vērtību, dalīta ar faktisko vērtību) ir viegli interpretējama, taču tai ir svarīgs ierobežojums: ja faktiskā pārdošanas vērtība ir vienāda ar nulli, procentuālo kļūdu nevar aprēķināt. Tas nozīmē, ka, analizējot datus, vairāku materiālu grupu APE nevarēja aprēķināt, jo tām šajā mēnesī nebija pārdošanas. Galu galā APE varēja aprēķināt tikai 13 no 21 prognozes gadījuma katram modelim. Tāpēc, paļaujoties tikai uz APE, daļa testa rezultātu tiek izslēgta no relatīvās kļūdas analīzes. Zāģmateriālu pārdošanas kontekstā tas ir slikti, jo nulles pārdošanas vērtības nav datu kļūdas, kuras var ignorēt, bet gan dabiska datu kopas sastāvdaļa. Šī darba kontekstā šo datu punktu ignorēšana ir vēl sliktāka, jo, kā jau minēts iepriekš, viens no galvenajiem darba ierobežojumiem ir pieejamo datu trūkums.</w:t>
@@ -22060,18 +22099,18 @@
       <w:pPr>
         <w:pStyle w:val="Teksts"/>
       </w:pPr>
-      <w:commentRangeStart w:id="140"/>
+      <w:commentRangeStart w:id="142"/>
       <w:r>
         <w:t xml:space="preserve">Varētu </w:t>
       </w:r>
-      <w:commentRangeEnd w:id="140"/>
+      <w:commentRangeEnd w:id="142"/>
       <w:r>
         <w:rPr>
           <w:rStyle w:val="CommentReference"/>
           <w:sz w:val="24"/>
           <w:szCs w:val="24"/>
         </w:rPr>
-        <w:commentReference w:id="140"/>
+        <w:commentReference w:id="142"/>
       </w:r>
       <w:r>
         <w:t>apgalvot, ka šī iemesla dēļ pastāv arī MAE un RMSE, taču arī tiem ir savas problēmas — tie nav relatīvi. MAE nav mērogojams, 1m</w:t>
@@ -22108,18 +22147,18 @@
       <w:pPr>
         <w:pStyle w:val="Teksts"/>
       </w:pPr>
-      <w:commentRangeStart w:id="141"/>
+      <w:commentRangeStart w:id="143"/>
       <w:r>
         <w:t xml:space="preserve">Lai </w:t>
       </w:r>
-      <w:commentRangeEnd w:id="141"/>
+      <w:commentRangeEnd w:id="143"/>
       <w:r>
         <w:rPr>
           <w:rStyle w:val="CommentReference"/>
           <w:sz w:val="24"/>
           <w:szCs w:val="24"/>
         </w:rPr>
-        <w:commentReference w:id="141"/>
+        <w:commentReference w:id="143"/>
       </w:r>
       <w:r>
         <w:t>risinātu šo</w:t>
@@ -22582,18 +22621,18 @@
       <w:pPr>
         <w:pStyle w:val="Teksts"/>
       </w:pPr>
-      <w:commentRangeStart w:id="142"/>
+      <w:commentRangeStart w:id="144"/>
       <w:r>
         <w:t xml:space="preserve">Citiem </w:t>
       </w:r>
-      <w:commentRangeEnd w:id="142"/>
+      <w:commentRangeEnd w:id="144"/>
       <w:r>
         <w:rPr>
           <w:rStyle w:val="CommentReference"/>
           <w:sz w:val="24"/>
           <w:szCs w:val="24"/>
         </w:rPr>
-        <w:commentReference w:id="142"/>
+        <w:commentReference w:id="144"/>
       </w:r>
       <w:r>
         <w:t xml:space="preserve">vārdiem sakot, šis rādītājs parāda, cik liela ir mēneša prognozes kļūda, salīdzinot ar materiālu grupas kopējo faktisko pārdošanas apjomu visā prognozes </w:t>
@@ -22622,18 +22661,18 @@
       <w:pPr>
         <w:pStyle w:val="Teksts"/>
       </w:pPr>
-      <w:commentRangeStart w:id="143"/>
+      <w:commentRangeStart w:id="145"/>
       <w:r>
         <w:t xml:space="preserve">Šī </w:t>
       </w:r>
-      <w:commentRangeEnd w:id="143"/>
+      <w:commentRangeEnd w:id="145"/>
       <w:r>
         <w:rPr>
           <w:rStyle w:val="CommentReference"/>
           <w:sz w:val="24"/>
           <w:szCs w:val="24"/>
         </w:rPr>
-        <w:commentReference w:id="143"/>
+        <w:commentReference w:id="145"/>
       </w:r>
       <w:r>
         <w:t>iemesla dēļ tika apsvērts vēl viens rādītājs, kas novērtē kļūdu materiālu grupas līmenī, summējot visas grupas absolūtās kļūdas prognozes periodā un dalot šo vērtību ar tās pašas grupas kopējo faktisko pārdošanas apjomu. Šāda veida rādītājs ģenerē septiņas vērtības, pa vienai katrai grupai:</w:t>
@@ -22928,18 +22967,18 @@
       <w:pPr>
         <w:pStyle w:val="Teksts"/>
       </w:pPr>
-      <w:commentRangeStart w:id="144"/>
+      <w:commentRangeStart w:id="146"/>
       <w:r>
         <w:t xml:space="preserve">Šis </w:t>
       </w:r>
-      <w:commentRangeEnd w:id="144"/>
+      <w:commentRangeEnd w:id="146"/>
       <w:r>
         <w:rPr>
           <w:rStyle w:val="CommentReference"/>
           <w:sz w:val="24"/>
           <w:szCs w:val="24"/>
         </w:rPr>
-        <w:commentReference w:id="144"/>
+        <w:commentReference w:id="146"/>
       </w:r>
       <w:r>
         <w:t>rādītājs parāda, cik liela ir materiālu grupas kopējā prognozēšanas kļūda salīdzinājumā ar tās pašas grupas kopējo faktisko pārdošanas apjomu prognozēšanas periodā. Tas atrisina pielāgotā APE problēmu, jo gan skaitītājs, gan saucējs tiek aprēķināti vienā un tajā pašā periodā. Tomēr šī rādītāja rezultāti arī nav īsti piemēroti</w:t>
@@ -22965,18 +23004,18 @@
           <w:tab w:val="right" w:pos="8222"/>
         </w:tabs>
       </w:pPr>
-      <w:commentRangeStart w:id="145"/>
+      <w:commentRangeStart w:id="147"/>
       <w:r>
         <w:t xml:space="preserve">Tika </w:t>
       </w:r>
-      <w:commentRangeEnd w:id="145"/>
+      <w:commentRangeEnd w:id="147"/>
       <w:r>
         <w:rPr>
           <w:rStyle w:val="CommentReference"/>
           <w:sz w:val="24"/>
           <w:szCs w:val="24"/>
         </w:rPr>
-        <w:commentReference w:id="145"/>
+        <w:commentReference w:id="147"/>
       </w:r>
       <w:r>
         <w:t>konstatēts, ka otrais rādītājs ir ļoti līdzīgs bieži izmantotajam prognozēšanas rādītājam, ko sauc par svērto absolūto procentuālo kļūdu (WAPE), ko dažviet dēvē arī par svērto vidējo absolūto procentuālo kļūdu (WMAPE). WMAPE prognozēšanas pētījumos tiek izmantots kā bezmēroga prognozēšanas precizitātes rādītājs, un to aprēķina kā vidējo absolūto kļūdu, dalītu ar vidējo faktisko vērtību</w:t>
@@ -23341,18 +23380,18 @@
       <w:pPr>
         <w:pStyle w:val="Teksts"/>
       </w:pPr>
-      <w:commentRangeStart w:id="146"/>
+      <w:commentRangeStart w:id="148"/>
       <w:r>
         <w:t xml:space="preserve">Vienkārši </w:t>
       </w:r>
-      <w:commentRangeEnd w:id="146"/>
+      <w:commentRangeEnd w:id="148"/>
       <w:r>
         <w:rPr>
           <w:rStyle w:val="CommentReference"/>
           <w:sz w:val="24"/>
           <w:szCs w:val="24"/>
         </w:rPr>
-        <w:commentReference w:id="146"/>
+        <w:commentReference w:id="148"/>
       </w:r>
       <w:r>
         <w:t xml:space="preserve">sakot, WAPE parāda, cik liela ir kopējā absolūtā prognozes kļūda, salīdzinot ar kopējo faktisko pārdošanas apjomu visā testa kopā. Tā kā nav nepieciešama dalīšana ar katru atsevišķo faktisko vērtību, prognožu gadījumi ar nulles mēneša pārdošanas apjomu joprojām tiek iekļauti novērtējumā. WAPE arī novērš divu iepriekšējo metriku radītās problēmas, jo atšķirībā no tiem tas ietver visus 21 prognozes </w:t>
@@ -23378,52 +23417,52 @@
       <w:pPr>
         <w:pStyle w:val="2-lm-virsraksts"/>
       </w:pPr>
-      <w:commentRangeStart w:id="147"/>
+      <w:commentRangeStart w:id="149"/>
       <w:r>
         <w:t>Metožu salīdzinājums un starpsecinājumi</w:t>
       </w:r>
-      <w:commentRangeEnd w:id="147"/>
+      <w:commentRangeEnd w:id="149"/>
       <w:r>
         <w:rPr>
           <w:rStyle w:val="CommentReference"/>
           <w:sz w:val="28"/>
           <w:szCs w:val="28"/>
         </w:rPr>
-        <w:commentReference w:id="147"/>
+        <w:commentReference w:id="149"/>
       </w:r>
     </w:p>
     <w:p>
       <w:pPr>
         <w:pStyle w:val="Teksts"/>
       </w:pPr>
-      <w:commentRangeStart w:id="148"/>
+      <w:commentRangeStart w:id="150"/>
       <w:r>
         <w:t xml:space="preserve">Lai </w:t>
       </w:r>
-      <w:commentRangeEnd w:id="148"/>
+      <w:commentRangeEnd w:id="150"/>
       <w:r>
         <w:rPr>
           <w:rStyle w:val="CommentReference"/>
           <w:sz w:val="24"/>
           <w:szCs w:val="24"/>
         </w:rPr>
-        <w:commentReference w:id="148"/>
+        <w:commentReference w:id="150"/>
       </w:r>
       <w:r>
         <w:t xml:space="preserve">salīdzinātu prognozēšanas metodes, katrs modelis ģenerēja viena mēneša prognozes tām pašām materiālu grupām un tiem pašiem trim testa mēnešiem. Tas neatspoguļo to, cik labi metodes kopumā darbojās, bet gan to, cik piemērota katra metode bija pašreizējam uzņēmuma datu kopumam. Lasītājiem jāpatur prātā arī atšķirība modeļa ievades datos: tradicionālajām metodēm tika doti tikai vēsturiskie pārdošanas apjomi, savukārt LSTM modelim papildus tika ņemtas piegādes, </w:t>
       </w:r>
-      <w:commentRangeStart w:id="149"/>
+      <w:commentRangeStart w:id="151"/>
       <w:r>
         <w:t xml:space="preserve">pārdošanas pirmās starpības </w:t>
       </w:r>
-      <w:commentRangeEnd w:id="149"/>
+      <w:commentRangeEnd w:id="151"/>
       <w:r>
         <w:rPr>
           <w:rStyle w:val="CommentReference"/>
           <w:sz w:val="24"/>
           <w:szCs w:val="24"/>
         </w:rPr>
-        <w:commentReference w:id="149"/>
+        <w:commentReference w:id="151"/>
       </w:r>
       <w:r>
         <w:t>un slīdošie pārdošanas vidējie dati. Tomēr šī atšķirība ir arī daļa no salīdzinājuma mērķa – viena no galvenajām idejām, kas pamatoja LSTM izmantošanu šajā darbā, bija parādīt, ka modelis var apstrādāt plašāku ievades struktūru, tādējādi tika sagaidīts, ka tas sasniegs labāku prognozēšanas precizitāti.</w:t>
@@ -23433,18 +23472,18 @@
       <w:pPr>
         <w:pStyle w:val="Teksts"/>
       </w:pPr>
-      <w:commentRangeStart w:id="150"/>
+      <w:commentRangeStart w:id="152"/>
       <w:r>
         <w:t xml:space="preserve">Apkopotie </w:t>
       </w:r>
-      <w:commentRangeEnd w:id="150"/>
+      <w:commentRangeEnd w:id="152"/>
       <w:r>
         <w:rPr>
           <w:rStyle w:val="CommentReference"/>
           <w:sz w:val="24"/>
           <w:szCs w:val="24"/>
         </w:rPr>
-        <w:commentReference w:id="150"/>
+        <w:commentReference w:id="152"/>
       </w:r>
       <w:r>
         <w:t>novērtēto metožu rezultāti ir parādīti 5.</w:t>
@@ -24108,18 +24147,18 @@
       <w:pPr>
         <w:pStyle w:val="Teksts"/>
       </w:pPr>
-      <w:commentRangeStart w:id="151"/>
+      <w:commentRangeStart w:id="153"/>
       <w:r>
         <w:t xml:space="preserve">Saskaņā </w:t>
       </w:r>
-      <w:commentRangeEnd w:id="151"/>
+      <w:commentRangeEnd w:id="153"/>
       <w:r>
         <w:rPr>
           <w:rStyle w:val="CommentReference"/>
           <w:sz w:val="24"/>
           <w:szCs w:val="24"/>
         </w:rPr>
-        <w:commentReference w:id="151"/>
+        <w:commentReference w:id="153"/>
       </w:r>
       <w:r>
         <w:t xml:space="preserve">ar WAPE datiem, labākais rezultāts tika iegūts ar naivo metodi. Tas nozīmē, ka pašreizējam datu kopumam, izmantojot iepriekšējā mēneša pārdošanas vērtību kā nākamā mēneša prognozi, tika iegūta mazāka kopējā relatīvā kļūda nekā SES, ARIMA un LSTM. Šis rezultāts nav tik pārsteidzošs pieejamo datu kontekstā. Laikrindas pat neaptver pilnu gada sezonālo ciklu. Šādos apstākļos vienkāršāka metode </w:t>
@@ -24157,18 +24196,18 @@
       <w:pPr>
         <w:pStyle w:val="Teksts"/>
       </w:pPr>
-      <w:commentRangeStart w:id="152"/>
+      <w:commentRangeStart w:id="154"/>
       <w:r>
         <w:t xml:space="preserve">SES </w:t>
       </w:r>
-      <w:commentRangeEnd w:id="152"/>
+      <w:commentRangeEnd w:id="154"/>
       <w:r>
         <w:rPr>
           <w:rStyle w:val="CommentReference"/>
           <w:sz w:val="24"/>
           <w:szCs w:val="24"/>
         </w:rPr>
-        <w:commentReference w:id="152"/>
+        <w:commentReference w:id="154"/>
       </w:r>
       <w:r>
         <w:t xml:space="preserve">metode pēc WAPE datiem deva otro labāko rezultātu </w:t>
@@ -24252,18 +24291,18 @@
       <w:pPr>
         <w:pStyle w:val="Teksts"/>
       </w:pPr>
-      <w:commentRangeStart w:id="153"/>
+      <w:commentRangeStart w:id="155"/>
       <w:r>
         <w:t xml:space="preserve">ARIMA </w:t>
       </w:r>
-      <w:commentRangeEnd w:id="153"/>
+      <w:commentRangeEnd w:id="155"/>
       <w:r>
         <w:rPr>
           <w:rStyle w:val="CommentReference"/>
           <w:sz w:val="24"/>
           <w:szCs w:val="24"/>
         </w:rPr>
-        <w:commentReference w:id="153"/>
+        <w:commentReference w:id="155"/>
       </w:r>
       <w:r>
         <w:t xml:space="preserve">modelis uzrādīja vājākus rezultātus nekā gan naivā, gan SES metode. </w:t>
@@ -24279,18 +24318,18 @@
       <w:pPr>
         <w:pStyle w:val="Teksts"/>
       </w:pPr>
-      <w:commentRangeStart w:id="154"/>
+      <w:commentRangeStart w:id="156"/>
       <w:r>
         <w:t xml:space="preserve">LSTM </w:t>
       </w:r>
-      <w:commentRangeEnd w:id="154"/>
+      <w:commentRangeEnd w:id="156"/>
       <w:r>
         <w:rPr>
           <w:rStyle w:val="CommentReference"/>
           <w:sz w:val="24"/>
           <w:szCs w:val="24"/>
         </w:rPr>
-        <w:commentReference w:id="154"/>
+        <w:commentReference w:id="156"/>
       </w:r>
       <w:r>
         <w:t>modelis uzrādīja vājāko WAPE rezultātu. Tas parāda, ka piekļuve plašākam ievades funkciju kopumam nekā tradicionālajām metodēm automātiski nenodrošina labāku prognozēšanas kvalitāti. LSTM modeļiem parasti ir nepieciešams pietiekami daudz apmācības piemēru, lai atklātu lineār</w:t>
@@ -24359,7 +24398,7 @@
           <w:lang w:val="en-GB"/>
         </w:rPr>
       </w:pPr>
-      <w:commentRangeStart w:id="155"/>
+      <w:commentRangeStart w:id="157"/>
       <w:r>
         <w:rPr>
           <w:lang w:val="en-GB"/>
@@ -24379,7 +24418,7 @@
         </w:rPr>
         <w:t xml:space="preserve"> datu palielināšana</w:t>
       </w:r>
-      <w:commentRangeEnd w:id="155"/>
+      <w:commentRangeEnd w:id="157"/>
       <w:r>
         <w:rPr>
           <w:rStyle w:val="CommentReference"/>
@@ -24387,7 +24426,7 @@
           <w:szCs w:val="28"/>
           <w:lang w:val="en-GB"/>
         </w:rPr>
-        <w:commentReference w:id="155"/>
+        <w:commentReference w:id="157"/>
       </w:r>
     </w:p>
     <w:p>
@@ -24855,18 +24894,18 @@
       <w:pPr>
         <w:pStyle w:val="Teksts"/>
       </w:pPr>
-      <w:commentRangeStart w:id="156"/>
+      <w:commentRangeStart w:id="158"/>
       <w:r>
         <w:t xml:space="preserve">Novērtēšanas </w:t>
       </w:r>
-      <w:commentRangeEnd w:id="156"/>
+      <w:commentRangeEnd w:id="158"/>
       <w:r>
         <w:rPr>
           <w:rStyle w:val="CommentReference"/>
           <w:sz w:val="24"/>
           <w:szCs w:val="24"/>
         </w:rPr>
-        <w:commentReference w:id="156"/>
+        <w:commentReference w:id="158"/>
       </w:r>
       <w:r>
         <w:t xml:space="preserve">protokols atspoguļo iepriekšējo nodaļu. Tiek saglabāti tie paši slīdošie vienu soli uz priekšu sadalījumi, un tie paši reālie testa mēneši paliek neskarti. </w:t>
@@ -25029,18 +25068,18 @@
       <w:r>
         <w:t xml:space="preserve">Tātad, pat ja </w:t>
       </w:r>
-      <w:commentRangeStart w:id="157"/>
+      <w:commentRangeStart w:id="159"/>
       <w:r>
         <w:t xml:space="preserve">mēs </w:t>
       </w:r>
-      <w:commentRangeEnd w:id="157"/>
+      <w:commentRangeEnd w:id="159"/>
       <w:r>
         <w:rPr>
           <w:rStyle w:val="CommentReference"/>
           <w:sz w:val="24"/>
           <w:szCs w:val="24"/>
         </w:rPr>
-        <w:commentReference w:id="157"/>
+        <w:commentReference w:id="159"/>
       </w:r>
       <w:r>
         <w:t>to izlaistu un imputācijas veikšanai (jeb vienkāršāk sakot, mēnešu kopēšanai) paļautos tikai uz sezonalitāti, kokmateriālu literatūra joprojām liecina par pretējo — pat ja tā liek domāt, ka sezonālā dinamika pastāv, tā joprojām ir ļoti specifiska tirgum un var mainīties laika gaitā (svārstīties). Šo iemeslu dēļ imputācija šajā pētījumā netiek izmantota.</w:t>
@@ -25061,18 +25100,18 @@
       <w:pPr>
         <w:pStyle w:val="Teksts"/>
       </w:pPr>
-      <w:commentRangeStart w:id="158"/>
+      <w:commentRangeStart w:id="160"/>
       <w:r>
         <w:t xml:space="preserve">Papildināšanas </w:t>
       </w:r>
-      <w:commentRangeEnd w:id="158"/>
+      <w:commentRangeEnd w:id="160"/>
       <w:r>
         <w:rPr>
           <w:rStyle w:val="CommentReference"/>
           <w:sz w:val="24"/>
           <w:szCs w:val="24"/>
         </w:rPr>
-        <w:commentReference w:id="158"/>
+        <w:commentReference w:id="160"/>
       </w:r>
       <w:r>
         <w:t xml:space="preserve">eksperiments tika </w:t>
@@ -26093,18 +26132,18 @@
       <w:pPr>
         <w:pStyle w:val="Teksts"/>
       </w:pPr>
-      <w:commentRangeStart w:id="159"/>
+      <w:commentRangeStart w:id="161"/>
       <w:r>
         <w:t xml:space="preserve">Salīdzinājums </w:t>
       </w:r>
-      <w:commentRangeEnd w:id="159"/>
+      <w:commentRangeEnd w:id="161"/>
       <w:r>
         <w:rPr>
           <w:rStyle w:val="CommentReference"/>
           <w:sz w:val="24"/>
           <w:szCs w:val="24"/>
         </w:rPr>
-        <w:commentReference w:id="159"/>
+        <w:commentReference w:id="161"/>
       </w:r>
       <w:r>
         <w:t xml:space="preserve">tika veikts ar sākotnējo LSTM modeli, kas apmācīts ar reāliem datiem. Salīdzinājumā tika iekļauts arī naivs modelis, jo tas ir galvenais bāzes modelis. Papildinātais LSTM izmantoja to pašu modeli, koda struktūru un testa periodus kā sākotnējais LSTM, bet apmācības laikā tika izmantoti papildinātie dati, kas tika sintezēti, aprēķinot blakus esošo apmācības paraugu vidējo vērtību. Rezultāti ir parādīti 6.8. tabulā. Tika izmantoti tie paši novērtēšanas rādītāji kā 5.7. sadaļā: MAE, RMSE, MAPE, </w:t>
@@ -26727,18 +26766,18 @@
       <w:pPr>
         <w:pStyle w:val="Teksts"/>
       </w:pPr>
-      <w:commentRangeStart w:id="160"/>
+      <w:commentRangeStart w:id="162"/>
       <w:r>
         <w:t xml:space="preserve">Rezultāti </w:t>
       </w:r>
-      <w:commentRangeEnd w:id="160"/>
+      <w:commentRangeEnd w:id="162"/>
       <w:r>
         <w:rPr>
           <w:rStyle w:val="CommentReference"/>
           <w:sz w:val="24"/>
           <w:szCs w:val="24"/>
         </w:rPr>
-        <w:commentReference w:id="160"/>
+        <w:commentReference w:id="162"/>
       </w:r>
       <w:r>
         <w:t>liecina, ka papildinātais LSTM nedaudz uzlaboja dažus apkopotos rādītājus, salīdzinot ar sākotnējo LSTM. MAE samazinājās no 3</w:t>
@@ -26853,18 +26892,18 @@
       <w:pPr>
         <w:pStyle w:val="Teksts"/>
       </w:pPr>
-      <w:commentRangeStart w:id="161"/>
+      <w:commentRangeStart w:id="163"/>
       <w:r>
         <w:t xml:space="preserve">Rezultātā </w:t>
       </w:r>
-      <w:commentRangeEnd w:id="161"/>
+      <w:commentRangeEnd w:id="163"/>
       <w:r>
         <w:rPr>
           <w:rStyle w:val="CommentReference"/>
           <w:sz w:val="24"/>
           <w:szCs w:val="24"/>
         </w:rPr>
-        <w:commentReference w:id="161"/>
+        <w:commentReference w:id="163"/>
       </w:r>
       <w:r>
         <w:t xml:space="preserve">nav skaidri redzams uzlabojums. RMSE </w:t>
@@ -27245,18 +27284,18 @@
       <w:pPr>
         <w:pStyle w:val="Teksts"/>
       </w:pPr>
-      <w:commentRangeStart w:id="162"/>
+      <w:commentRangeStart w:id="164"/>
       <w:r>
         <w:t xml:space="preserve">6.9. tabulā </w:t>
       </w:r>
-      <w:commentRangeEnd w:id="162"/>
+      <w:commentRangeEnd w:id="164"/>
       <w:r>
         <w:rPr>
           <w:rStyle w:val="CommentReference"/>
           <w:sz w:val="24"/>
           <w:szCs w:val="24"/>
         </w:rPr>
-        <w:commentReference w:id="162"/>
+        <w:commentReference w:id="164"/>
       </w:r>
       <w:r>
         <w:t>redzams, ka uzlabojums nav sistemātisks: paplašinātais modelis uzlaboja prognozes tikai 9 no 21 gadījuma, bet pasliktināja 11. Tas nozīmē, ka nedaudz labākās MAE un WAPE vērtības nebija saistītas ar labāku modeli, bet gan</w:t>
@@ -27931,34 +27970,34 @@
       <w:pPr>
         <w:pStyle w:val="Teksts"/>
       </w:pPr>
-      <w:commentRangeStart w:id="163"/>
+      <w:commentRangeStart w:id="165"/>
       <w:r>
         <w:t xml:space="preserve">Sadalījums </w:t>
       </w:r>
-      <w:commentRangeEnd w:id="163"/>
+      <w:commentRangeEnd w:id="165"/>
       <w:r>
         <w:rPr>
           <w:rStyle w:val="CommentReference"/>
           <w:sz w:val="24"/>
           <w:szCs w:val="24"/>
         </w:rPr>
-        <w:commentReference w:id="163"/>
+        <w:commentReference w:id="165"/>
       </w:r>
       <w:r>
         <w:t xml:space="preserve">rāda, ka </w:t>
       </w:r>
-      <w:commentRangeStart w:id="164"/>
+      <w:commentRangeStart w:id="166"/>
       <w:r>
         <w:t xml:space="preserve">paplašinātais LSTM </w:t>
       </w:r>
-      <w:commentRangeEnd w:id="164"/>
+      <w:commentRangeEnd w:id="166"/>
       <w:r>
         <w:rPr>
           <w:rStyle w:val="CommentReference"/>
           <w:sz w:val="24"/>
           <w:szCs w:val="24"/>
         </w:rPr>
-        <w:commentReference w:id="164"/>
+        <w:commentReference w:id="166"/>
       </w:r>
       <w:r>
         <w:t>galvenokārt uzlaboja prognozes nulles pārdošanas gadījumiem. Šajā grupā MAE samazinājās no 3</w:t>
@@ -28018,18 +28057,18 @@
       <w:r>
         <w:t xml:space="preserve"> </w:t>
       </w:r>
-      <w:commentRangeStart w:id="165"/>
+      <w:commentRangeStart w:id="167"/>
       <w:r>
         <w:t xml:space="preserve">Šis </w:t>
       </w:r>
-      <w:commentRangeEnd w:id="165"/>
+      <w:commentRangeEnd w:id="167"/>
       <w:r>
         <w:rPr>
           <w:rStyle w:val="CommentReference"/>
           <w:sz w:val="24"/>
           <w:szCs w:val="24"/>
         </w:rPr>
-        <w:commentReference w:id="165"/>
+        <w:commentReference w:id="167"/>
       </w:r>
       <w:r>
         <w:t xml:space="preserve">rezultāts izskaidro nelielo WAPE uzlabojumu — nulles pārdošanas gadījumu kopējā kļūda samazinājās, samazinot kopējo absolūto kļūdu, bet uzlabojumu lielākoties kompensēja sliktākas </w:t>
@@ -28051,18 +28090,18 @@
       <w:pPr>
         <w:pStyle w:val="Teksts"/>
       </w:pPr>
-      <w:commentRangeStart w:id="166"/>
+      <w:commentRangeStart w:id="168"/>
       <w:r>
         <w:t xml:space="preserve">Šāds </w:t>
       </w:r>
-      <w:commentRangeEnd w:id="166"/>
+      <w:commentRangeEnd w:id="168"/>
       <w:r>
         <w:rPr>
           <w:rStyle w:val="CommentReference"/>
           <w:sz w:val="24"/>
           <w:szCs w:val="24"/>
         </w:rPr>
-        <w:commentReference w:id="166"/>
+        <w:commentReference w:id="168"/>
       </w:r>
       <w:r>
         <w:t>rezultāts, iespējams, ir saistīts ar</w:t>
@@ -28210,12 +28249,12 @@
       <w:pPr>
         <w:pStyle w:val="1-lm-nenumurts-virsraksts"/>
       </w:pPr>
-      <w:bookmarkStart w:id="167" w:name="_Toc225535011"/>
+      <w:bookmarkStart w:id="169" w:name="_Toc225535011"/>
       <w:r>
         <w:lastRenderedPageBreak/>
         <w:t>Rezultāti un secinājumi</w:t>
       </w:r>
-      <w:bookmarkEnd w:id="167"/>
+      <w:bookmarkEnd w:id="169"/>
     </w:p>
     <w:p>
       <w:pPr>
@@ -28747,14 +28786,14 @@
       <w:pPr>
         <w:pStyle w:val="1-lm-nenumurts-virsraksts"/>
       </w:pPr>
-      <w:bookmarkStart w:id="168" w:name="_Toc88602609"/>
-      <w:bookmarkStart w:id="169" w:name="_Toc225535012"/>
+      <w:bookmarkStart w:id="170" w:name="_Toc88602609"/>
+      <w:bookmarkStart w:id="171" w:name="_Toc225535012"/>
       <w:r>
         <w:lastRenderedPageBreak/>
         <w:t>Izmantotie informācijas avoti</w:t>
       </w:r>
-      <w:bookmarkEnd w:id="168"/>
-      <w:bookmarkEnd w:id="169"/>
+      <w:bookmarkEnd w:id="170"/>
+      <w:bookmarkEnd w:id="171"/>
       <w:r>
         <w:fldChar w:fldCharType="begin"/>
       </w:r>
@@ -29885,13 +29924,13 @@
       <w:pPr>
         <w:pStyle w:val="Pielikumi-virsraksts"/>
       </w:pPr>
-      <w:bookmarkStart w:id="170" w:name="_Toc88602610"/>
-      <w:bookmarkStart w:id="171" w:name="_Toc225535013"/>
+      <w:bookmarkStart w:id="172" w:name="_Toc88602610"/>
+      <w:bookmarkStart w:id="173" w:name="_Toc225535013"/>
       <w:r>
         <w:t>Pielikumi</w:t>
       </w:r>
-      <w:bookmarkEnd w:id="170"/>
-      <w:bookmarkEnd w:id="171"/>
+      <w:bookmarkEnd w:id="172"/>
+      <w:bookmarkEnd w:id="173"/>
     </w:p>
     <w:p>
       <w:r>
@@ -45240,7 +45279,7 @@
       </w:pPr>
     </w:p>
   </w:comment>
-  <w:comment w:id="74" w:author="Deniss" w:date="2026-03-30T16:43:00Z" w:initials="D">
+  <w:comment w:id="74" w:author="Deniss" w:date="2026-05-15T18:44:00Z" w:initials="D">
     <w:p>
       <w:pPr>
         <w:pStyle w:val="CommentText"/>
@@ -45252,23 +45291,26 @@
         <w:annotationRef/>
       </w:r>
       <w:r>
+        <w:rPr>
+          <w:noProof/>
+        </w:rPr>
+        <w:t>remake</w:t>
+      </w:r>
+    </w:p>
+  </w:comment>
+  <w:comment w:id="75" w:author="Deniss" w:date="2026-03-30T16:43:00Z" w:initials="D">
+    <w:p>
+      <w:pPr>
+        <w:pStyle w:val="CommentText"/>
+      </w:pPr>
+      <w:r>
+        <w:rPr>
+          <w:rStyle w:val="CommentReference"/>
+        </w:rPr>
+        <w:annotationRef/>
+      </w:r>
+      <w:r>
         <w:t>Для задачи прогнозирования основной интерес представляет таблица sales, поскольку именно на ее основе далее формируется целевая переменная, связанная с объемом продаж. Таблица deliveries при этом сохраняет вспомогательное значение, так как поставки могут использоваться как дополнительный входной признак в нейросетевом подходе, но не как основной объект прогноза.</w:t>
-      </w:r>
-    </w:p>
-  </w:comment>
-  <w:comment w:id="75" w:author="Deniss" w:date="2026-03-30T18:33:00Z" w:initials="D">
-    <w:p>
-      <w:pPr>
-        <w:pStyle w:val="CommentText"/>
-      </w:pPr>
-      <w:r>
-        <w:rPr>
-          <w:rStyle w:val="CommentReference"/>
-        </w:rPr>
-        <w:annotationRef/>
-      </w:r>
-      <w:r>
-        <w:t>Таким образом, на данном этапе можно считать, что исходные данные уже преобразованы в аналитически пригодную форму, и следующей задачей становится оценка того, насколько эти данные подходят именно для построения прогностических моделей.</w:t>
       </w:r>
     </w:p>
   </w:comment>
@@ -45284,11 +45326,27 @@
         <w:annotationRef/>
       </w:r>
       <w:r>
+        <w:t>Таким образом, на данном этапе можно считать, что исходные данные уже преобразованы в аналитически пригодную форму, и следующей задачей становится оценка того, насколько эти данные подходят именно для построения прогностических моделей.</w:t>
+      </w:r>
+    </w:p>
+  </w:comment>
+  <w:comment w:id="77" w:author="Deniss" w:date="2026-03-30T18:33:00Z" w:initials="D">
+    <w:p>
+      <w:pPr>
+        <w:pStyle w:val="CommentText"/>
+      </w:pPr>
+      <w:r>
+        <w:rPr>
+          <w:rStyle w:val="CommentReference"/>
+        </w:rPr>
+        <w:annotationRef/>
+      </w:r>
+      <w:r>
         <w:t>Как было сказано ранее, доступные наблюдения охватывают период с июля 2025 года по март 2026 года включительно. Это означает, что в распоряжении находится только девять последовательных месяцев наблюдений. Уже одно это накладывает существенные ограничения на последующий прогноз, поскольку в данных отсутствует хотя бы один полный годовой цикл. Следовательно, даже если в поведении продаж присутствует сезонность, полноценно выявить и проверить ее на таком горизонте затруднительно.</w:t>
       </w:r>
     </w:p>
   </w:comment>
-  <w:comment w:id="77" w:author="Deniss" w:date="2026-03-30T16:47:00Z" w:initials="D">
+  <w:comment w:id="78" w:author="Deniss" w:date="2026-03-30T16:47:00Z" w:initials="D">
     <w:p>
       <w:pPr>
         <w:pStyle w:val="CommentText"/>
@@ -45307,7 +45365,7 @@
       </w:r>
     </w:p>
   </w:comment>
-  <w:comment w:id="78" w:author="Deniss" w:date="2026-03-30T18:33:00Z" w:initials="D">
+  <w:comment w:id="79" w:author="Deniss" w:date="2026-03-30T18:33:00Z" w:initials="D">
     <w:p>
       <w:pPr>
         <w:pStyle w:val="CommentText"/>
@@ -45323,7 +45381,7 @@
       </w:r>
     </w:p>
   </w:comment>
-  <w:comment w:id="79" w:author="Deniss" w:date="2026-03-30T21:27:00Z" w:initials="D">
+  <w:comment w:id="80" w:author="Deniss" w:date="2026-03-30T21:27:00Z" w:initials="D">
     <w:p>
       <w:pPr>
         <w:pStyle w:val="CommentText"/>
@@ -45552,7 +45610,7 @@
       </w:r>
     </w:p>
   </w:comment>
-  <w:comment w:id="80" w:author="Deniss" w:date="2026-03-30T18:33:00Z" w:initials="D">
+  <w:comment w:id="81" w:author="Deniss" w:date="2026-03-30T18:33:00Z" w:initials="D">
     <w:p>
       <w:pPr>
         <w:pStyle w:val="CommentText"/>
@@ -45565,22 +45623,6 @@
       </w:r>
       <w:r>
         <w:t>По графику продаж видно, что наблюдаемый период действительно короткий: на временной оси представлена лишь часть года, причем без повторения тех же месяцев второго года. Это означает, что работа должна опираться не на сложные сезонные конструкции, а на более осторожные и устойчивые подходы, пригодные для коротких рядов. Одновременно график количества материалов показывает, что база наблюдений в первые месяцы еще формировалась, а значит, ранние периоды следует рассматривать с осторожностью.</w:t>
-      </w:r>
-    </w:p>
-  </w:comment>
-  <w:comment w:id="81" w:author="Deniss" w:date="2026-03-30T18:33:00Z" w:initials="D">
-    <w:p>
-      <w:pPr>
-        <w:pStyle w:val="CommentText"/>
-      </w:pPr>
-      <w:r>
-        <w:rPr>
-          <w:rStyle w:val="CommentReference"/>
-        </w:rPr>
-        <w:annotationRef/>
-      </w:r>
-      <w:r>
-        <w:t>Из этого следует важный промежуточный вывод: доступные данные ограничены и по длине временного горизонта, и по полноте ранних наблюдений. Именно это в дальнейшем становится одним из главных аргументов в пользу укрупнения объекта прогноза и отказа от слишком детализированного прогнозирования на уровне отдельных материалов.</w:t>
       </w:r>
     </w:p>
   </w:comment>
@@ -45596,11 +45638,27 @@
         <w:annotationRef/>
       </w:r>
       <w:r>
+        <w:t>Из этого следует важный промежуточный вывод: доступные данные ограничены и по длине временного горизонта, и по полноте ранних наблюдений. Именно это в дальнейшем становится одним из главных аргументов в пользу укрупнения объекта прогноза и отказа от слишком детализированного прогнозирования на уровне отдельных материалов.</w:t>
+      </w:r>
+    </w:p>
+  </w:comment>
+  <w:comment w:id="83" w:author="Deniss" w:date="2026-03-30T18:33:00Z" w:initials="D">
+    <w:p>
+      <w:pPr>
+        <w:pStyle w:val="CommentText"/>
+      </w:pPr>
+      <w:r>
+        <w:rPr>
+          <w:rStyle w:val="CommentReference"/>
+        </w:rPr>
+        <w:annotationRef/>
+      </w:r>
+      <w:r>
         <w:t>С точки зрения задачи прогнозирования данные о продажах и поставках играют разную роль. Продажи напрямую отражают фактический спрос и потому естественным образом становятся основным объектом прогнозирования. Поставки, напротив, описывают пополнение запасов и зависят не только от спроса, но и от внутренних решений предприятия, логистики, сроков закупки и особенностей поставщиков.</w:t>
       </w:r>
     </w:p>
   </w:comment>
-  <w:comment w:id="83" w:author="Deniss" w:date="2026-03-30T19:45:00Z" w:initials="D">
+  <w:comment w:id="84" w:author="Deniss" w:date="2026-03-30T19:45:00Z" w:initials="D">
     <w:p>
       <w:pPr>
         <w:pStyle w:val="CommentText"/>
@@ -45616,7 +45674,7 @@
       </w:r>
     </w:p>
   </w:comment>
-  <w:comment w:id="84" w:author="Deniss" w:date="2026-03-30T18:53:00Z" w:initials="D">
+  <w:comment w:id="85" w:author="Deniss" w:date="2026-03-30T18:53:00Z" w:initials="D">
     <w:p>
       <w:pPr>
         <w:pStyle w:val="CommentText"/>
@@ -45707,7 +45765,7 @@
       </w:r>
     </w:p>
   </w:comment>
-  <w:comment w:id="85" w:author="Deniss" w:date="2026-03-30T19:45:00Z" w:initials="D">
+  <w:comment w:id="86" w:author="Deniss" w:date="2026-03-30T19:45:00Z" w:initials="D">
     <w:p>
       <w:pPr>
         <w:pStyle w:val="CommentText"/>
@@ -45723,7 +45781,7 @@
       </w:r>
     </w:p>
   </w:comment>
-  <w:comment w:id="86" w:author="Deniss" w:date="2026-03-30T19:45:00Z" w:initials="D">
+  <w:comment w:id="87" w:author="Deniss" w:date="2026-03-30T19:45:00Z" w:initials="D">
     <w:p>
       <w:pPr>
         <w:pStyle w:val="CommentText"/>
@@ -45739,7 +45797,7 @@
       </w:r>
     </w:p>
   </w:comment>
-  <w:comment w:id="87" w:author="Deniss" w:date="2026-03-30T20:15:00Z" w:initials="D">
+  <w:comment w:id="88" w:author="Deniss" w:date="2026-03-30T20:15:00Z" w:initials="D">
     <w:p>
       <w:pPr>
         <w:pStyle w:val="CommentText"/>
@@ -45755,7 +45813,7 @@
       </w:r>
     </w:p>
   </w:comment>
-  <w:comment w:id="88" w:author="Deniss" w:date="2026-03-30T20:16:00Z" w:initials="D">
+  <w:comment w:id="89" w:author="Deniss" w:date="2026-03-30T20:16:00Z" w:initials="D">
     <w:p>
       <w:pPr>
         <w:pStyle w:val="CommentText"/>
@@ -45899,7 +45957,7 @@
       </w:r>
     </w:p>
   </w:comment>
-  <w:comment w:id="89" w:author="Deniss" w:date="2026-03-30T20:29:00Z" w:initials="D">
+  <w:comment w:id="90" w:author="Deniss" w:date="2026-03-30T20:29:00Z" w:initials="D">
     <w:p>
       <w:pPr>
         <w:pStyle w:val="CommentText"/>
@@ -46011,7 +46069,7 @@
       </w:r>
     </w:p>
   </w:comment>
-  <w:comment w:id="90" w:author="Deniss" w:date="2026-03-30T20:30:00Z" w:initials="D">
+  <w:comment w:id="91" w:author="Deniss" w:date="2026-03-30T20:30:00Z" w:initials="D">
     <w:p>
       <w:pPr>
         <w:pStyle w:val="CommentText"/>
@@ -46068,7 +46126,7 @@
       </w:r>
     </w:p>
   </w:comment>
-  <w:comment w:id="91" w:author="Deniss" w:date="2026-03-30T20:28:00Z" w:initials="D">
+  <w:comment w:id="92" w:author="Deniss" w:date="2026-03-30T20:28:00Z" w:initials="D">
     <w:p>
       <w:pPr>
         <w:pStyle w:val="CommentText"/>
@@ -46084,7 +46142,7 @@
       </w:r>
     </w:p>
   </w:comment>
-  <w:comment w:id="92" w:author="Deniss" w:date="2026-03-30T20:27:00Z" w:initials="D">
+  <w:comment w:id="93" w:author="Deniss" w:date="2026-03-30T20:27:00Z" w:initials="D">
     <w:p>
       <w:pPr>
         <w:pStyle w:val="CommentText"/>
@@ -46100,7 +46158,7 @@
       </w:r>
     </w:p>
   </w:comment>
-  <w:comment w:id="93" w:author="Deniss" w:date="2026-03-30T20:36:00Z" w:initials="D">
+  <w:comment w:id="94" w:author="Deniss" w:date="2026-03-30T20:36:00Z" w:initials="D">
     <w:p>
       <w:pPr>
         <w:pStyle w:val="CommentText"/>
@@ -46236,7 +46294,7 @@
       </w:r>
     </w:p>
   </w:comment>
-  <w:comment w:id="94" w:author="Deniss" w:date="2026-03-30T20:38:00Z" w:initials="D">
+  <w:comment w:id="95" w:author="Deniss" w:date="2026-03-30T20:38:00Z" w:initials="D">
     <w:p>
       <w:pPr>
         <w:pStyle w:val="CommentText"/>
@@ -46267,7 +46325,7 @@
       </w:r>
     </w:p>
   </w:comment>
-  <w:comment w:id="95" w:author="Deniss" w:date="2026-04-10T14:35:00Z" w:initials="D">
+  <w:comment w:id="96" w:author="Deniss" w:date="2026-04-10T14:35:00Z" w:initials="D">
     <w:p>
       <w:pPr>
         <w:pStyle w:val="CommentText"/>
@@ -46286,7 +46344,7 @@
       </w:r>
     </w:p>
   </w:comment>
-  <w:comment w:id="96" w:author="Deniss" w:date="2026-03-30T20:56:00Z" w:initials="D">
+  <w:comment w:id="97" w:author="Deniss" w:date="2026-03-30T20:56:00Z" w:initials="D">
     <w:p>
       <w:pPr>
         <w:pStyle w:val="CommentText"/>
@@ -46326,7 +46384,7 @@
       </w:r>
     </w:p>
   </w:comment>
-  <w:comment w:id="97" w:author="Deniss" w:date="2026-04-10T14:35:00Z" w:initials="D">
+  <w:comment w:id="98" w:author="Deniss" w:date="2026-04-10T14:35:00Z" w:initials="D">
     <w:p>
       <w:pPr>
         <w:pStyle w:val="CommentText"/>
@@ -46345,7 +46403,7 @@
       </w:r>
     </w:p>
   </w:comment>
-  <w:comment w:id="99" w:author="Deniss" w:date="2026-03-30T20:56:00Z" w:initials="D">
+  <w:comment w:id="100" w:author="Deniss" w:date="2026-03-30T20:56:00Z" w:initials="D">
     <w:p>
       <w:pPr>
         <w:pStyle w:val="CommentText"/>
@@ -46361,7 +46419,7 @@
       </w:r>
     </w:p>
   </w:comment>
-  <w:comment w:id="98" w:author="Deniss" w:date="2026-04-10T14:32:00Z" w:initials="D">
+  <w:comment w:id="99" w:author="Deniss" w:date="2026-04-10T14:32:00Z" w:initials="D">
     <w:p>
       <w:pPr>
         <w:pStyle w:val="CommentText"/>
@@ -46380,7 +46438,7 @@
       </w:r>
     </w:p>
   </w:comment>
-  <w:comment w:id="100" w:author="Deniss" w:date="2026-03-30T20:59:00Z" w:initials="D">
+  <w:comment w:id="101" w:author="Deniss" w:date="2026-03-30T20:59:00Z" w:initials="D">
     <w:p>
       <w:pPr>
         <w:pStyle w:val="CommentText"/>
@@ -46401,41 +46459,6 @@
       </w:pPr>
       <w:r>
         <w:t>Для построения рядов в данной работе используется месячный шаг. Для каждой выбранной группы brand+category формируется последовательность значений за месяцы от июля 2025 года до марта 2026 года. Если в пределах наблюдаемого месяца продаж по данной группе не зафиксировано, берется ноль. Такое правило приемлемо именно на уровне агрегированных групп, поскольку месяц при этом остается частью общего периода наблюдения, просто без единной продажи.</w:t>
-      </w:r>
-    </w:p>
-  </w:comment>
-  <w:comment w:id="101" w:author="Deniss" w:date="2026-03-30T21:29:00Z" w:initials="D">
-    <w:p>
-      <w:pPr>
-        <w:pStyle w:val="CommentText"/>
-      </w:pPr>
-      <w:r>
-        <w:rPr>
-          <w:rStyle w:val="CommentReference"/>
-        </w:rPr>
-        <w:annotationRef/>
-      </w:r>
-      <w:r>
-        <w:rPr>
-          <w:noProof/>
-        </w:rPr>
-        <w:t>šo daļu var izmantot nakotnē datu sintezēšanai, būtu jāaprēķinā korelācija utt</w:t>
-      </w:r>
-    </w:p>
-  </w:comment>
-  <w:comment w:id="102" w:author="Deniss" w:date="2026-03-30T21:26:00Z" w:initials="D">
-    <w:p>
-      <w:pPr>
-        <w:pStyle w:val="CommentText"/>
-      </w:pPr>
-      <w:r>
-        <w:rPr>
-          <w:rStyle w:val="CommentReference"/>
-        </w:rPr>
-        <w:annotationRef/>
-      </w:r>
-      <w:r>
-        <w:t>Отдельный вопрос насколько ранние месяцы наблюдения отражают реальный спроса, как сильно на него повлияло постепенное формирование самой учетной базы. Для этого полезно сопоставить две величины: количество задокументированных значимых материалов и суммарные продажи по месяцам. Этот график можно увидеть на картинке 4.3. Визуально в первой части рассматриваемого периода наблюдается совместный рост этих двух показателей. По мере того как в базу заносится больше материалов, возрастает и суммарный зафиксированный объем продаж. Это не доказывает автоматически, что продажи в ранние месяцы были сильно занижены, однако указывает на возможную зависимость между полнотой учета и величиной спроса. Другими словами, ранние месяцы могут быть слабыми не только потому, что спрос тогда был ниже, но и потому, что учет к тому моменту еще не охватывал весь продаваемый ассортимент.</w:t>
       </w:r>
     </w:p>
   </w:comment>
@@ -46451,11 +46474,76 @@
         <w:annotationRef/>
       </w:r>
       <w:r>
+        <w:rPr>
+          <w:noProof/>
+        </w:rPr>
+        <w:t>šo daļu var izmantot nakotnē datu sintezēšanai, būtu jāaprēķinā korelācija utt</w:t>
+      </w:r>
+    </w:p>
+  </w:comment>
+  <w:comment w:id="102" w:author="Deniss" w:date="2026-05-15T18:42:00Z" w:initials="D">
+    <w:p>
+      <w:pPr>
+        <w:pStyle w:val="CommentText"/>
+        <w:rPr>
+          <w:lang w:val="en-GB"/>
+        </w:rPr>
+      </w:pPr>
+      <w:r>
+        <w:rPr>
+          <w:rStyle w:val="CommentReference"/>
+        </w:rPr>
+        <w:annotationRef/>
+      </w:r>
+      <w:r>
+        <w:rPr>
+          <w:noProof/>
+          <w:lang w:val="en-GB"/>
+        </w:rPr>
+        <w:t>renam</w:t>
+      </w:r>
+      <w:r>
+        <w:rPr>
+          <w:noProof/>
+          <w:lang w:val="en-GB"/>
+        </w:rPr>
+        <w:t>e?</w:t>
+      </w:r>
+    </w:p>
+  </w:comment>
+  <w:comment w:id="104" w:author="Deniss" w:date="2026-03-30T21:26:00Z" w:initials="D">
+    <w:p>
+      <w:pPr>
+        <w:pStyle w:val="CommentText"/>
+      </w:pPr>
+      <w:r>
+        <w:rPr>
+          <w:rStyle w:val="CommentReference"/>
+        </w:rPr>
+        <w:annotationRef/>
+      </w:r>
+      <w:r>
+        <w:t>Отдельный вопрос насколько ранние месяцы наблюдения отражают реальный спроса, как сильно на него повлияло постепенное формирование самой учетной базы. Для этого полезно сопоставить две величины: количество задокументированных значимых материалов и суммарные продажи по месяцам. Этот график можно увидеть на картинке 4.3. Визуально в первой части рассматриваемого периода наблюдается совместный рост этих двух показателей. По мере того как в базу заносится больше материалов, возрастает и суммарный зафиксированный объем продаж. Это не доказывает автоматически, что продажи в ранние месяцы были сильно занижены, однако указывает на возможную зависимость между полнотой учета и величиной спроса. Другими словами, ранние месяцы могут быть слабыми не только потому, что спрос тогда был ниже, но и потому, что учет к тому моменту еще не охватывал весь продаваемый ассортимент.</w:t>
+      </w:r>
+    </w:p>
+  </w:comment>
+  <w:comment w:id="105" w:author="Deniss" w:date="2026-03-30T21:29:00Z" w:initials="D">
+    <w:p>
+      <w:pPr>
+        <w:pStyle w:val="CommentText"/>
+      </w:pPr>
+      <w:r>
+        <w:rPr>
+          <w:rStyle w:val="CommentReference"/>
+        </w:rPr>
+        <w:annotationRef/>
+      </w:r>
+      <w:r>
         <w:t>Это подтверждает уже сделанный ранее вывод: доступные данные ограничены не только по длине периода, но и по степени полноты учета в начале наблюдений.</w:t>
       </w:r>
     </w:p>
   </w:comment>
-  <w:comment w:id="104" w:author="Deniss" w:date="2026-04-10T14:39:00Z" w:initials="D">
+  <w:comment w:id="106" w:author="Deniss" w:date="2026-04-10T14:39:00Z" w:initials="D">
     <w:p>
       <w:pPr>
         <w:pStyle w:val="CommentText"/>
@@ -46474,7 +46562,7 @@
       </w:r>
     </w:p>
   </w:comment>
-  <w:comment w:id="105" w:author="Deniss" w:date="2026-04-10T02:02:00Z" w:initials="D">
+  <w:comment w:id="107" w:author="Deniss" w:date="2026-04-10T02:02:00Z" w:initials="D">
     <w:p>
       <w:pPr>
         <w:pStyle w:val="CommentText"/>
@@ -46570,7 +46658,7 @@
       </w:r>
     </w:p>
   </w:comment>
-  <w:comment w:id="106" w:author="Deniss" w:date="2026-04-10T01:59:00Z" w:initials="D">
+  <w:comment w:id="108" w:author="Deniss" w:date="2026-04-10T01:59:00Z" w:initials="D">
     <w:p>
       <w:pPr>
         <w:pStyle w:val="CommentText"/>
@@ -47593,7 +47681,7 @@
       </w:pPr>
     </w:p>
   </w:comment>
-  <w:comment w:id="107" w:author="Deniss" w:date="2026-04-10T14:42:00Z" w:initials="D">
+  <w:comment w:id="109" w:author="Deniss" w:date="2026-04-10T14:42:00Z" w:initials="D">
     <w:p>
       <w:pPr>
         <w:pStyle w:val="CommentText"/>
@@ -47633,7 +47721,7 @@
       </w:r>
     </w:p>
   </w:comment>
-  <w:comment w:id="108" w:author="Deniss" w:date="2026-04-10T14:44:00Z" w:initials="D">
+  <w:comment w:id="110" w:author="Deniss" w:date="2026-04-10T14:44:00Z" w:initials="D">
     <w:p>
       <w:pPr>
         <w:pStyle w:val="CommentText"/>
@@ -47646,38 +47734,6 @@
       </w:r>
       <w:r>
         <w:t>Таким образом, каждый следующий эксперимент использует немного болье данных для обучения и проверяет прогноз на следующем месяце. Это позволяет получить несколько последовательных результатов и сравнить устойчивость методов, чтобы убедится в их эфективности.</w:t>
-      </w:r>
-    </w:p>
-  </w:comment>
-  <w:comment w:id="109" w:author="Deniss" w:date="2026-04-10T15:07:00Z" w:initials="D">
-    <w:p>
-      <w:pPr>
-        <w:pStyle w:val="CommentText"/>
-      </w:pPr>
-      <w:r>
-        <w:rPr>
-          <w:rStyle w:val="CommentReference"/>
-        </w:rPr>
-        <w:annotationRef/>
-      </w:r>
-      <w:r>
-        <w:t>Наивный прогноз представляет собой самый простой способ прогнозирования, при котором значение следующего месяца принимается равным значению предыдущего. Формально это можно записать следующим образом:</w:t>
-      </w:r>
-    </w:p>
-  </w:comment>
-  <w:comment w:id="110" w:author="Deniss" w:date="2026-04-10T15:07:00Z" w:initials="D">
-    <w:p>
-      <w:pPr>
-        <w:pStyle w:val="CommentText"/>
-      </w:pPr>
-      <w:r>
-        <w:rPr>
-          <w:rStyle w:val="CommentReference"/>
-        </w:rPr>
-        <w:annotationRef/>
-      </w:r>
-      <w:r>
-        <w:t>Иными словами, при прогнозировании января 2026 года использовалось значение декабря 2025 года, при прогнозировании февраля 2026 года — значение января 2026 года, а при прогнозировании марта 2026 года — значение февраля 2026 года.</w:t>
       </w:r>
     </w:p>
   </w:comment>
@@ -47693,7 +47749,7 @@
         <w:annotationRef/>
       </w:r>
       <w:r>
-        <w:t>В данной работе наивный прогноз используется как минимальный эталон сравнения для остальных методов. Если более сложная модель не показывает лучшего результата, чем простое перенесение значения предыдущего месяца, то ее практическое преимущество на данном наборе данных нельзя считать подтвержденным.</w:t>
+        <w:t>Наивный прогноз представляет собой самый простой способ прогнозирования, при котором значение следующего месяца принимается равным значению предыдущего. Формально это можно записать следующим образом:</w:t>
       </w:r>
     </w:p>
   </w:comment>
@@ -47709,11 +47765,43 @@
         <w:annotationRef/>
       </w:r>
       <w:r>
+        <w:t>Иными словами, при прогнозировании января 2026 года использовалось значение декабря 2025 года, при прогнозировании февраля 2026 года — значение января 2026 года, а при прогнозировании марта 2026 года — значение февраля 2026 года.</w:t>
+      </w:r>
+    </w:p>
+  </w:comment>
+  <w:comment w:id="113" w:author="Deniss" w:date="2026-04-10T15:07:00Z" w:initials="D">
+    <w:p>
+      <w:pPr>
+        <w:pStyle w:val="CommentText"/>
+      </w:pPr>
+      <w:r>
+        <w:rPr>
+          <w:rStyle w:val="CommentReference"/>
+        </w:rPr>
+        <w:annotationRef/>
+      </w:r>
+      <w:r>
+        <w:t>В данной работе наивный прогноз используется как минимальный эталон сравнения для остальных методов. Если более сложная модель не показывает лучшего результата, чем простое перенесение значения предыдущего месяца, то ее практическое преимущество на данном наборе данных нельзя считать подтвержденным.</w:t>
+      </w:r>
+    </w:p>
+  </w:comment>
+  <w:comment w:id="114" w:author="Deniss" w:date="2026-04-10T15:07:00Z" w:initials="D">
+    <w:p>
+      <w:pPr>
+        <w:pStyle w:val="CommentText"/>
+      </w:pPr>
+      <w:r>
+        <w:rPr>
+          <w:rStyle w:val="CommentReference"/>
+        </w:rPr>
+        <w:annotationRef/>
+      </w:r>
+      <w:r>
         <w:t>Совпадение прогноза более сложной модели с наивным прогнозом не рассматривается как ошибка постановки эксперимента, а напротив, показывает, что в некоторых случаях baseline уже адекватно описывает динамику продаж. Премущество более сложной модели выявляется савокупностью меньших ошибочных прогнозов среди всех трех тестов. Другими словами, если сложный метод дает тот же результат, что naive, это полезно - это дает проверить, действительно ли сложность модели в сравнении с baseline окупается</w:t>
       </w:r>
     </w:p>
   </w:comment>
-  <w:comment w:id="113" w:author="Deniss" w:date="2026-04-10T17:46:00Z" w:initials="D">
+  <w:comment w:id="115" w:author="Deniss" w:date="2026-04-10T17:46:00Z" w:initials="D">
     <w:p>
       <w:pPr>
         <w:pStyle w:val="CommentText"/>
@@ -47729,7 +47817,7 @@
       </w:r>
     </w:p>
   </w:comment>
-  <w:comment w:id="114" w:author="Deniss" w:date="2026-04-10T18:36:00Z" w:initials="D">
+  <w:comment w:id="116" w:author="Deniss" w:date="2026-04-10T18:36:00Z" w:initials="D">
     <w:p>
       <w:pPr>
         <w:pStyle w:val="CommentText"/>
@@ -47742,7 +47830,7 @@
       </w:r>
     </w:p>
   </w:comment>
-  <w:comment w:id="115" w:author="Deniss" w:date="2026-04-10T18:36:00Z" w:initials="D">
+  <w:comment w:id="117" w:author="Deniss" w:date="2026-04-10T18:36:00Z" w:initials="D">
     <w:p>
       <w:pPr>
         <w:pStyle w:val="CommentText"/>
@@ -47758,7 +47846,7 @@
       </w:r>
     </w:p>
   </w:comment>
-  <w:comment w:id="116" w:author="Deniss" w:date="2026-04-13T14:56:00Z" w:initials="D">
+  <w:comment w:id="118" w:author="Deniss" w:date="2026-04-13T14:56:00Z" w:initials="D">
     <w:p>
       <w:pPr>
         <w:pStyle w:val="CommentText"/>
@@ -47774,7 +47862,7 @@
       </w:r>
     </w:p>
   </w:comment>
-  <w:comment w:id="117" w:author="Deniss" w:date="2026-04-13T14:35:00Z" w:initials="D">
+  <w:comment w:id="119" w:author="Deniss" w:date="2026-04-13T14:35:00Z" w:initials="D">
     <w:p>
       <w:pPr>
         <w:pStyle w:val="CommentText"/>
@@ -47790,7 +47878,7 @@
       </w:r>
     </w:p>
   </w:comment>
-  <w:comment w:id="120" w:author="Deniss" w:date="2026-04-13T15:49:00Z" w:initials="D">
+  <w:comment w:id="122" w:author="Deniss" w:date="2026-04-13T15:49:00Z" w:initials="D">
     <w:p>
       <w:pPr>
         <w:pStyle w:val="CommentText"/>
@@ -47806,7 +47894,7 @@
       </w:r>
     </w:p>
   </w:comment>
-  <w:comment w:id="119" w:author="Deniss" w:date="2026-04-13T15:58:00Z" w:initials="D">
+  <w:comment w:id="121" w:author="Deniss" w:date="2026-04-13T15:58:00Z" w:initials="D">
     <w:p>
       <w:pPr>
         <w:pStyle w:val="CommentText"/>
@@ -47825,7 +47913,7 @@
       </w:r>
     </w:p>
   </w:comment>
-  <w:comment w:id="121" w:author="Deniss" w:date="2026-04-13T16:02:00Z" w:initials="D">
+  <w:comment w:id="123" w:author="Deniss" w:date="2026-04-13T16:02:00Z" w:initials="D">
     <w:p>
       <w:pPr>
         <w:pStyle w:val="CommentText"/>
@@ -47844,7 +47932,7 @@
       </w:r>
     </w:p>
   </w:comment>
-  <w:comment w:id="122" w:author="Deniss" w:date="2026-04-13T16:23:00Z" w:initials="D">
+  <w:comment w:id="124" w:author="Deniss" w:date="2026-04-13T16:23:00Z" w:initials="D">
     <w:p>
       <w:pPr>
         <w:pStyle w:val="CommentText"/>
@@ -47860,7 +47948,7 @@
       </w:r>
     </w:p>
   </w:comment>
-  <w:comment w:id="123" w:author="Deniss" w:date="2026-04-13T16:18:00Z" w:initials="D">
+  <w:comment w:id="125" w:author="Deniss" w:date="2026-04-13T16:18:00Z" w:initials="D">
     <w:p>
       <w:pPr>
         <w:pStyle w:val="CommentText"/>
@@ -47876,7 +47964,7 @@
       </w:r>
     </w:p>
   </w:comment>
-  <w:comment w:id="124" w:author="Deniss" w:date="2026-04-13T16:19:00Z" w:initials="D">
+  <w:comment w:id="126" w:author="Deniss" w:date="2026-04-13T16:19:00Z" w:initials="D">
     <w:p>
       <w:pPr>
         <w:pStyle w:val="CommentText"/>
@@ -47892,7 +47980,7 @@
       </w:r>
     </w:p>
   </w:comment>
-  <w:comment w:id="125" w:author="Deniss" w:date="2026-04-10T17:12:00Z" w:initials="D">
+  <w:comment w:id="127" w:author="Deniss" w:date="2026-04-10T17:12:00Z" w:initials="D">
     <w:p>
       <w:pPr>
         <w:pStyle w:val="CommentText"/>
@@ -48130,7 +48218,7 @@
       </w:pPr>
     </w:p>
   </w:comment>
-  <w:comment w:id="126" w:author="Deniss" w:date="2026-04-15T21:45:00Z" w:initials="D">
+  <w:comment w:id="128" w:author="Deniss" w:date="2026-04-15T21:45:00Z" w:initials="D">
     <w:p>
       <w:pPr>
         <w:pStyle w:val="CommentText"/>
@@ -48146,7 +48234,7 @@
       </w:r>
     </w:p>
   </w:comment>
-  <w:comment w:id="127" w:author="Deniss" w:date="2026-04-15T21:39:00Z" w:initials="D">
+  <w:comment w:id="129" w:author="Deniss" w:date="2026-04-15T21:39:00Z" w:initials="D">
     <w:p>
       <w:pPr>
         <w:pStyle w:val="CommentText"/>
@@ -48162,7 +48250,7 @@
       </w:r>
     </w:p>
   </w:comment>
-  <w:comment w:id="128" w:author="Deniss" w:date="2026-04-15T22:12:00Z" w:initials="D">
+  <w:comment w:id="130" w:author="Deniss" w:date="2026-04-15T22:12:00Z" w:initials="D">
     <w:p>
       <w:pPr>
         <w:pStyle w:val="CommentText"/>
@@ -48178,7 +48266,7 @@
       </w:r>
     </w:p>
   </w:comment>
-  <w:comment w:id="129" w:author="Deniss" w:date="2026-04-15T22:30:00Z" w:initials="D">
+  <w:comment w:id="131" w:author="Deniss" w:date="2026-04-15T22:30:00Z" w:initials="D">
     <w:p>
       <w:pPr>
         <w:pStyle w:val="CommentText"/>
@@ -48194,7 +48282,7 @@
       </w:r>
     </w:p>
   </w:comment>
-  <w:comment w:id="130" w:author="Deniss" w:date="2026-04-15T22:30:00Z" w:initials="D">
+  <w:comment w:id="132" w:author="Deniss" w:date="2026-04-15T22:30:00Z" w:initials="D">
     <w:p>
       <w:pPr>
         <w:pStyle w:val="CommentText"/>
@@ -48210,7 +48298,7 @@
       </w:r>
     </w:p>
   </w:comment>
-  <w:comment w:id="131" w:author="Deniss" w:date="2026-04-17T16:08:00Z" w:initials="D">
+  <w:comment w:id="133" w:author="Deniss" w:date="2026-04-17T16:08:00Z" w:initials="D">
     <w:p>
       <w:pPr>
         <w:pStyle w:val="CommentText"/>
@@ -48229,7 +48317,7 @@
       </w:r>
     </w:p>
   </w:comment>
-  <w:comment w:id="132" w:author="Deniss" w:date="2026-04-17T16:11:00Z" w:initials="D">
+  <w:comment w:id="134" w:author="Deniss" w:date="2026-04-17T16:11:00Z" w:initials="D">
     <w:p>
       <w:pPr>
         <w:pStyle w:val="CommentText"/>
@@ -48248,7 +48336,7 @@
       </w:r>
     </w:p>
   </w:comment>
-  <w:comment w:id="133" w:author="Deniss" w:date="2026-04-17T16:44:00Z" w:initials="D">
+  <w:comment w:id="135" w:author="Deniss" w:date="2026-04-17T16:44:00Z" w:initials="D">
     <w:p>
       <w:pPr>
         <w:pStyle w:val="CommentText"/>
@@ -48267,7 +48355,7 @@
       </w:r>
     </w:p>
   </w:comment>
-  <w:comment w:id="134" w:author="Deniss" w:date="2026-04-18T11:55:00Z" w:initials="D">
+  <w:comment w:id="136" w:author="Deniss" w:date="2026-04-18T11:55:00Z" w:initials="D">
     <w:p>
       <w:pPr>
         <w:pStyle w:val="CommentText"/>
@@ -48411,7 +48499,7 @@
       </w:r>
     </w:p>
   </w:comment>
-  <w:comment w:id="136" w:author="Deniss" w:date="2026-04-18T12:47:00Z" w:initials="D">
+  <w:comment w:id="138" w:author="Deniss" w:date="2026-04-18T12:47:00Z" w:initials="D">
     <w:p>
       <w:pPr>
         <w:pStyle w:val="CommentText"/>
@@ -48556,7 +48644,7 @@
       </w:pPr>
     </w:p>
   </w:comment>
-  <w:comment w:id="135" w:author="Deniss" w:date="2026-04-18T13:36:00Z" w:initials="D">
+  <w:comment w:id="137" w:author="Deniss" w:date="2026-04-18T13:36:00Z" w:initials="D">
     <w:p>
       <w:pPr>
         <w:pStyle w:val="CommentText"/>
@@ -48607,7 +48695,7 @@
       </w:r>
     </w:p>
   </w:comment>
-  <w:comment w:id="137" w:author="Deniss" w:date="2026-04-18T13:32:00Z" w:initials="D">
+  <w:comment w:id="139" w:author="Deniss" w:date="2026-04-18T13:32:00Z" w:initials="D">
     <w:p>
       <w:pPr>
         <w:pStyle w:val="CommentText"/>
@@ -48636,7 +48724,7 @@
       </w:r>
     </w:p>
   </w:comment>
-  <w:comment w:id="138" w:author="Deniss" w:date="2026-04-18T18:44:00Z" w:initials="D">
+  <w:comment w:id="140" w:author="Deniss" w:date="2026-04-18T18:44:00Z" w:initials="D">
     <w:p>
       <w:pPr>
         <w:pStyle w:val="CommentText"/>
@@ -48678,7 +48766,7 @@
       </w:r>
     </w:p>
   </w:comment>
-  <w:comment w:id="139" w:author="Deniss" w:date="2026-05-11T15:49:00Z" w:initials="D">
+  <w:comment w:id="141" w:author="Deniss" w:date="2026-05-11T15:49:00Z" w:initials="D">
     <w:p>
       <w:pPr>
         <w:pStyle w:val="CommentText"/>
@@ -48694,7 +48782,7 @@
       </w:r>
     </w:p>
   </w:comment>
-  <w:comment w:id="140" w:author="Deniss" w:date="2026-05-11T21:45:00Z" w:initials="D">
+  <w:comment w:id="142" w:author="Deniss" w:date="2026-05-11T21:45:00Z" w:initials="D">
     <w:p>
       <w:pPr>
         <w:pStyle w:val="CommentText"/>
@@ -48710,7 +48798,7 @@
       </w:r>
     </w:p>
   </w:comment>
-  <w:comment w:id="141" w:author="Deniss" w:date="2026-05-11T15:52:00Z" w:initials="D">
+  <w:comment w:id="143" w:author="Deniss" w:date="2026-05-11T15:52:00Z" w:initials="D">
     <w:p>
       <w:pPr>
         <w:pStyle w:val="CommentText"/>
@@ -48726,7 +48814,7 @@
       </w:r>
     </w:p>
   </w:comment>
-  <w:comment w:id="142" w:author="Deniss" w:date="2026-05-11T16:11:00Z" w:initials="D">
+  <w:comment w:id="144" w:author="Deniss" w:date="2026-05-11T16:11:00Z" w:initials="D">
     <w:p>
       <w:pPr>
         <w:pStyle w:val="CommentText"/>
@@ -48742,7 +48830,7 @@
       </w:r>
     </w:p>
   </w:comment>
-  <w:comment w:id="143" w:author="Deniss" w:date="2026-05-11T16:28:00Z" w:initials="D">
+  <w:comment w:id="145" w:author="Deniss" w:date="2026-05-11T16:28:00Z" w:initials="D">
     <w:p>
       <w:pPr>
         <w:pStyle w:val="CommentText"/>
@@ -48758,7 +48846,7 @@
       </w:r>
     </w:p>
   </w:comment>
-  <w:comment w:id="144" w:author="Deniss" w:date="2026-05-11T18:58:00Z" w:initials="D">
+  <w:comment w:id="146" w:author="Deniss" w:date="2026-05-11T18:58:00Z" w:initials="D">
     <w:p>
       <w:pPr>
         <w:pStyle w:val="CommentText"/>
@@ -48774,7 +48862,7 @@
       </w:r>
     </w:p>
   </w:comment>
-  <w:comment w:id="145" w:author="Deniss" w:date="2026-05-11T19:56:00Z" w:initials="D">
+  <w:comment w:id="147" w:author="Deniss" w:date="2026-05-11T19:56:00Z" w:initials="D">
     <w:p>
       <w:pPr>
         <w:pStyle w:val="CommentText"/>
@@ -48790,7 +48878,7 @@
       </w:r>
     </w:p>
   </w:comment>
-  <w:comment w:id="146" w:author="Deniss" w:date="2026-05-11T19:19:00Z" w:initials="D">
+  <w:comment w:id="148" w:author="Deniss" w:date="2026-05-11T19:19:00Z" w:initials="D">
     <w:p>
       <w:pPr>
         <w:pStyle w:val="CommentText"/>
@@ -48806,7 +48894,7 @@
       </w:r>
     </w:p>
   </w:comment>
-  <w:comment w:id="147" w:author="Deniss" w:date="2026-04-19T14:23:00Z" w:initials="D">
+  <w:comment w:id="149" w:author="Deniss" w:date="2026-04-19T14:23:00Z" w:initials="D">
     <w:p>
       <w:pPr>
         <w:pStyle w:val="CommentText"/>
@@ -48822,7 +48910,7 @@
       </w:r>
     </w:p>
   </w:comment>
-  <w:comment w:id="148" w:author="Deniss" w:date="2026-05-11T22:33:00Z" w:initials="D">
+  <w:comment w:id="150" w:author="Deniss" w:date="2026-05-11T22:33:00Z" w:initials="D">
     <w:p>
       <w:pPr>
         <w:pStyle w:val="CommentText"/>
@@ -48838,7 +48926,7 @@
       </w:r>
     </w:p>
   </w:comment>
-  <w:comment w:id="149" w:author="Deniss" w:date="2026-05-11T22:32:00Z" w:initials="D">
+  <w:comment w:id="151" w:author="Deniss" w:date="2026-05-11T22:32:00Z" w:initials="D">
     <w:p>
       <w:pPr>
         <w:pStyle w:val="CommentText"/>
@@ -48857,7 +48945,7 @@
       </w:r>
     </w:p>
   </w:comment>
-  <w:comment w:id="150" w:author="Deniss" w:date="2026-05-11T22:37:00Z" w:initials="D">
+  <w:comment w:id="152" w:author="Deniss" w:date="2026-05-11T22:37:00Z" w:initials="D">
     <w:p>
       <w:pPr>
         <w:pStyle w:val="CommentText"/>
@@ -48873,7 +48961,7 @@
       </w:r>
     </w:p>
   </w:comment>
-  <w:comment w:id="151" w:author="Deniss" w:date="2026-05-11T22:58:00Z" w:initials="D">
+  <w:comment w:id="153" w:author="Deniss" w:date="2026-05-11T22:58:00Z" w:initials="D">
     <w:p>
       <w:pPr>
         <w:pStyle w:val="CommentText"/>
@@ -48886,38 +48974,6 @@
       </w:r>
       <w:r>
         <w:t>According to WAPE, the best result was obtained by the naive method. This means that, for the current dataset, using the previous month’s sales value as the next month’s forecast produced a smaller total relative error than SES, ARIMA and LSTM. This result is not that surprising in the context of the available data. The time series do not even cover a complete yearly seasonal cycle. Under such conditions, a simpler method can be more stable than a more complex one that tries to take into account trend and smoothing behaviour and nonlinear relationships and whatnot from a small dataset.</w:t>
-      </w:r>
-    </w:p>
-  </w:comment>
-  <w:comment w:id="152" w:author="Deniss" w:date="2026-05-11T23:15:00Z" w:initials="D">
-    <w:p>
-      <w:pPr>
-        <w:pStyle w:val="CommentText"/>
-      </w:pPr>
-      <w:r>
-        <w:rPr>
-          <w:rStyle w:val="CommentReference"/>
-        </w:rPr>
-        <w:annotationRef/>
-      </w:r>
-      <w:r>
-        <w:t>The SES method produced the second-best result by WAPE. However, it did not improve over the naive baseline. This suggests that smoothing the available sales history did not provide enough additional information compared with using the most recent observation directly. In this dataset, several material groups show irregular monthly changes and zero-sales months. Therefore, a smoothed historical level may continue predicting positive sales even when the actual value is zero, or may react too slowly to sudden changes in demand. Similar observations are also found in applied forecasting comparisons, where more complex or more general methods do not necessarily outperform simpler baselines. Rosenblad (2021) shows that simple exponential smoothing can outperform more complex ARIMA configurations in a practical forecasting comparison.</w:t>
-      </w:r>
-    </w:p>
-  </w:comment>
-  <w:comment w:id="153" w:author="Deniss" w:date="2026-05-11T23:14:00Z" w:initials="D">
-    <w:p>
-      <w:pPr>
-        <w:pStyle w:val="CommentText"/>
-      </w:pPr>
-      <w:r>
-        <w:rPr>
-          <w:rStyle w:val="CommentReference"/>
-        </w:rPr>
-        <w:annotationRef/>
-      </w:r>
-      <w:r>
-        <w:t>The ARIMA model produced weaker results than both the naive and SES methods. Yes again, this result does not mean that ARIMA is generally unsuitable for sales forecasting. It merely says, that the model has not performed well enough in this work. Just like others, the result is most likely connected with the short and irregular structure of the available data.</w:t>
       </w:r>
     </w:p>
   </w:comment>
@@ -48933,11 +48989,43 @@
         <w:annotationRef/>
       </w:r>
       <w:r>
+        <w:t>The SES method produced the second-best result by WAPE. However, it did not improve over the naive baseline. This suggests that smoothing the available sales history did not provide enough additional information compared with using the most recent observation directly. In this dataset, several material groups show irregular monthly changes and zero-sales months. Therefore, a smoothed historical level may continue predicting positive sales even when the actual value is zero, or may react too slowly to sudden changes in demand. Similar observations are also found in applied forecasting comparisons, where more complex or more general methods do not necessarily outperform simpler baselines. Rosenblad (2021) shows that simple exponential smoothing can outperform more complex ARIMA configurations in a practical forecasting comparison.</w:t>
+      </w:r>
+    </w:p>
+  </w:comment>
+  <w:comment w:id="155" w:author="Deniss" w:date="2026-05-11T23:14:00Z" w:initials="D">
+    <w:p>
+      <w:pPr>
+        <w:pStyle w:val="CommentText"/>
+      </w:pPr>
+      <w:r>
+        <w:rPr>
+          <w:rStyle w:val="CommentReference"/>
+        </w:rPr>
+        <w:annotationRef/>
+      </w:r>
+      <w:r>
+        <w:t>The ARIMA model produced weaker results than both the naive and SES methods. Yes again, this result does not mean that ARIMA is generally unsuitable for sales forecasting. It merely says, that the model has not performed well enough in this work. Just like others, the result is most likely connected with the short and irregular structure of the available data.</w:t>
+      </w:r>
+    </w:p>
+  </w:comment>
+  <w:comment w:id="156" w:author="Deniss" w:date="2026-05-11T23:15:00Z" w:initials="D">
+    <w:p>
+      <w:pPr>
+        <w:pStyle w:val="CommentText"/>
+      </w:pPr>
+      <w:r>
+        <w:rPr>
+          <w:rStyle w:val="CommentReference"/>
+        </w:rPr>
+        <w:annotationRef/>
+      </w:r>
+      <w:r>
         <w:t>The LSTM model produced the weakest WAPE result. It shows that having access to a broader input feature set than the traditional methods does not automatically lead to better forecasting quality. LSTM models usually require enough training examples to reveal linear patterns. Not only did the current experiment fail to provide them, the number of material groups and zero-sales cases made the forecasting even more unstable. As a result, the model sometimes predicted sales when there was none and missed several large changes in demand, resulting in such a bad WAPE value. Therefore, the LSTM result does not sufficiently prove that neural networks are suitable for this task, but it does show that the current dataset is not enough to demonstrate an advantage.</w:t>
       </w:r>
     </w:p>
   </w:comment>
-  <w:comment w:id="155" w:author="Deniss" w:date="2026-04-19T15:39:00Z" w:initials="D">
+  <w:comment w:id="157" w:author="Deniss" w:date="2026-04-19T15:39:00Z" w:initials="D">
     <w:p>
       <w:pPr>
         <w:pStyle w:val="CommentText"/>
@@ -48956,7 +49044,7 @@
       </w:r>
     </w:p>
   </w:comment>
-  <w:comment w:id="156" w:author="Deniss" w:date="2026-04-19T17:53:00Z" w:initials="D">
+  <w:comment w:id="158" w:author="Deniss" w:date="2026-04-19T17:53:00Z" w:initials="D">
     <w:p>
       <w:pPr>
         <w:pStyle w:val="CommentText"/>
@@ -48972,7 +49060,7 @@
       </w:r>
     </w:p>
   </w:comment>
-  <w:comment w:id="157" w:author="Deniss" w:date="2026-04-19T19:12:00Z" w:initials="D">
+  <w:comment w:id="159" w:author="Deniss" w:date="2026-04-19T19:12:00Z" w:initials="D">
     <w:p>
       <w:pPr>
         <w:pStyle w:val="CommentText"/>
@@ -48991,7 +49079,7 @@
       </w:r>
     </w:p>
   </w:comment>
-  <w:comment w:id="158" w:author="Deniss" w:date="2026-04-19T20:47:00Z" w:initials="D">
+  <w:comment w:id="160" w:author="Deniss" w:date="2026-04-19T20:47:00Z" w:initials="D">
     <w:p>
       <w:pPr>
         <w:pStyle w:val="CommentText"/>
@@ -49007,7 +49095,7 @@
       </w:r>
     </w:p>
   </w:comment>
-  <w:comment w:id="159" w:author="Deniss" w:date="2026-05-13T12:27:00Z" w:initials="D">
+  <w:comment w:id="161" w:author="Deniss" w:date="2026-05-13T12:27:00Z" w:initials="D">
     <w:p>
       <w:pPr>
         <w:pStyle w:val="CommentText"/>
@@ -49023,7 +49111,7 @@
       </w:r>
     </w:p>
   </w:comment>
-  <w:comment w:id="160" w:author="Deniss" w:date="2026-05-13T12:46:00Z" w:initials="D">
+  <w:comment w:id="162" w:author="Deniss" w:date="2026-05-13T12:46:00Z" w:initials="D">
     <w:p>
       <w:pPr>
         <w:pStyle w:val="CommentText"/>
@@ -49039,7 +49127,7 @@
       </w:r>
     </w:p>
   </w:comment>
-  <w:comment w:id="161" w:author="Deniss" w:date="2026-05-13T13:04:00Z" w:initials="D">
+  <w:comment w:id="163" w:author="Deniss" w:date="2026-05-13T13:04:00Z" w:initials="D">
     <w:p>
       <w:pPr>
         <w:pStyle w:val="CommentText"/>
@@ -49068,7 +49156,7 @@
       </w:pPr>
     </w:p>
   </w:comment>
-  <w:comment w:id="162" w:author="Deniss" w:date="2026-05-13T13:16:00Z" w:initials="D">
+  <w:comment w:id="164" w:author="Deniss" w:date="2026-05-13T13:16:00Z" w:initials="D">
     <w:p>
       <w:pPr>
         <w:pStyle w:val="CommentText"/>
@@ -49116,7 +49204,7 @@
       </w:r>
     </w:p>
   </w:comment>
-  <w:comment w:id="163" w:author="Deniss" w:date="2026-05-13T13:48:00Z" w:initials="D">
+  <w:comment w:id="165" w:author="Deniss" w:date="2026-05-13T13:48:00Z" w:initials="D">
     <w:p>
       <w:pPr>
         <w:pStyle w:val="CommentText"/>
@@ -49132,7 +49220,7 @@
       </w:r>
     </w:p>
   </w:comment>
-  <w:comment w:id="164" w:author="Deniss" w:date="2026-05-13T23:02:00Z" w:initials="D">
+  <w:comment w:id="166" w:author="Deniss" w:date="2026-05-13T23:02:00Z" w:initials="D">
     <w:p>
       <w:pPr>
         <w:pStyle w:val="CommentText"/>
@@ -49163,7 +49251,7 @@
       </w:r>
     </w:p>
   </w:comment>
-  <w:comment w:id="165" w:author="Deniss" w:date="2026-05-13T14:01:00Z" w:initials="D">
+  <w:comment w:id="167" w:author="Deniss" w:date="2026-05-13T14:01:00Z" w:initials="D">
     <w:p>
       <w:pPr>
         <w:pStyle w:val="CommentText"/>
@@ -49179,7 +49267,7 @@
       </w:r>
     </w:p>
   </w:comment>
-  <w:comment w:id="166" w:author="Deniss" w:date="2026-05-13T22:36:00Z" w:initials="D">
+  <w:comment w:id="168" w:author="Deniss" w:date="2026-05-13T22:36:00Z" w:initials="D">
     <w:p>
       <w:pPr>
         <w:pStyle w:val="CommentText"/>
@@ -49222,129 +49310,131 @@
   <w15:commentEx w15:paraId="1E8926FE" w15:done="0"/>
   <w15:commentEx w15:paraId="730D8FFE" w15:done="0"/>
   <w15:commentEx w15:paraId="38B7557E" w15:done="0"/>
-  <w15:commentEx w15:paraId="15884B8B" w15:done="0"/>
-  <w15:commentEx w15:paraId="287DDEB2" w15:done="0"/>
+  <w15:commentEx w15:paraId="15884B8B" w15:done="1"/>
+  <w15:commentEx w15:paraId="287DDEB2" w15:done="1"/>
   <w15:commentEx w15:paraId="1329DA36" w15:done="0"/>
-  <w15:commentEx w15:paraId="6932FF60" w15:done="0"/>
-  <w15:commentEx w15:paraId="4CD4C789" w15:done="0"/>
-  <w15:commentEx w15:paraId="4AE3D603" w15:done="0"/>
-  <w15:commentEx w15:paraId="1D41F954" w15:done="0"/>
-  <w15:commentEx w15:paraId="3A6C3321" w15:done="0"/>
-  <w15:commentEx w15:paraId="39A7D956" w15:done="0"/>
-  <w15:commentEx w15:paraId="417D379D" w15:done="0"/>
-  <w15:commentEx w15:paraId="2E3729D3" w15:done="0"/>
-  <w15:commentEx w15:paraId="4F1D9268" w15:done="0"/>
-  <w15:commentEx w15:paraId="307A9EE5" w15:done="0"/>
-  <w15:commentEx w15:paraId="07408B86" w15:done="0"/>
-  <w15:commentEx w15:paraId="2D3289AC" w15:done="0"/>
+  <w15:commentEx w15:paraId="6932FF60" w15:done="1"/>
+  <w15:commentEx w15:paraId="4CD4C789" w15:done="1"/>
+  <w15:commentEx w15:paraId="4AE3D603" w15:done="1"/>
+  <w15:commentEx w15:paraId="1D41F954" w15:done="1"/>
+  <w15:commentEx w15:paraId="3A6C3321" w15:done="1"/>
+  <w15:commentEx w15:paraId="39A7D956" w15:done="1"/>
+  <w15:commentEx w15:paraId="417D379D" w15:done="1"/>
+  <w15:commentEx w15:paraId="2E3729D3" w15:done="1"/>
+  <w15:commentEx w15:paraId="4F1D9268" w15:done="1"/>
+  <w15:commentEx w15:paraId="307A9EE5" w15:done="1"/>
+  <w15:commentEx w15:paraId="07408B86" w15:done="1"/>
+  <w15:commentEx w15:paraId="2D3289AC" w15:done="1"/>
   <w15:commentEx w15:paraId="15021E30" w15:done="0"/>
   <w15:commentEx w15:paraId="08B056A4" w15:done="0"/>
-  <w15:commentEx w15:paraId="057CC0DF" w15:done="0"/>
-  <w15:commentEx w15:paraId="315484F2" w15:done="0"/>
-  <w15:commentEx w15:paraId="3BA6760B" w15:done="0"/>
-  <w15:commentEx w15:paraId="5D917BFD" w15:done="0"/>
-  <w15:commentEx w15:paraId="0A8A8FD8" w15:done="0"/>
-  <w15:commentEx w15:paraId="42051B3B" w15:done="0"/>
-  <w15:commentEx w15:paraId="548679B5" w15:done="0"/>
-  <w15:commentEx w15:paraId="14AFDE26" w15:done="0"/>
-  <w15:commentEx w15:paraId="5F835CCE" w15:done="0"/>
-  <w15:commentEx w15:paraId="3FA64062" w15:done="0"/>
-  <w15:commentEx w15:paraId="40262D6B" w15:done="0"/>
-  <w15:commentEx w15:paraId="01769B50" w15:done="0"/>
-  <w15:commentEx w15:paraId="442D4927" w15:done="0"/>
-  <w15:commentEx w15:paraId="1B057BE2" w15:done="0"/>
-  <w15:commentEx w15:paraId="0260BBC1" w15:done="0"/>
-  <w15:commentEx w15:paraId="4709D2D1" w15:done="0"/>
-  <w15:commentEx w15:paraId="69B579A0" w15:done="0"/>
+  <w15:commentEx w15:paraId="057CC0DF" w15:done="1"/>
+  <w15:commentEx w15:paraId="315484F2" w15:done="1"/>
+  <w15:commentEx w15:paraId="3BA6760B" w15:done="1"/>
+  <w15:commentEx w15:paraId="5D917BFD" w15:done="1"/>
+  <w15:commentEx w15:paraId="0A8A8FD8" w15:done="1"/>
+  <w15:commentEx w15:paraId="42051B3B" w15:done="1"/>
+  <w15:commentEx w15:paraId="548679B5" w15:done="1"/>
+  <w15:commentEx w15:paraId="14AFDE26" w15:done="1"/>
+  <w15:commentEx w15:paraId="5F835CCE" w15:done="1"/>
+  <w15:commentEx w15:paraId="3FA64062" w15:done="1"/>
+  <w15:commentEx w15:paraId="40262D6B" w15:done="1"/>
+  <w15:commentEx w15:paraId="01769B50" w15:done="1"/>
+  <w15:commentEx w15:paraId="442D4927" w15:done="1"/>
+  <w15:commentEx w15:paraId="1B057BE2" w15:done="1"/>
+  <w15:commentEx w15:paraId="44E47A9D" w15:done="0"/>
+  <w15:commentEx w15:paraId="0260BBC1" w15:done="1"/>
+  <w15:commentEx w15:paraId="4709D2D1" w15:done="1"/>
+  <w15:commentEx w15:paraId="69B579A0" w15:done="1"/>
   <w15:commentEx w15:paraId="1DDFB060" w15:done="0"/>
-  <w15:commentEx w15:paraId="3F9F0C67" w15:done="0"/>
-  <w15:commentEx w15:paraId="08B900BC" w15:done="0"/>
-  <w15:commentEx w15:paraId="3C7BF8CC" w15:done="0"/>
-  <w15:commentEx w15:paraId="633D4486" w15:done="0"/>
-  <w15:commentEx w15:paraId="5C6591A6" w15:done="0"/>
-  <w15:commentEx w15:paraId="6A0FF1B8" w15:done="0"/>
-  <w15:commentEx w15:paraId="4E187C41" w15:done="0"/>
-  <w15:commentEx w15:paraId="70AA48BA" w15:done="0"/>
-  <w15:commentEx w15:paraId="0747B42C" w15:done="0"/>
-  <w15:commentEx w15:paraId="5951D6CB" w15:done="0"/>
-  <w15:commentEx w15:paraId="5272623C" w15:done="0"/>
-  <w15:commentEx w15:paraId="7537EDD2" w15:done="0"/>
-  <w15:commentEx w15:paraId="1DE8EB26" w15:done="0"/>
-  <w15:commentEx w15:paraId="09C3E246" w15:done="0"/>
-  <w15:commentEx w15:paraId="2DB7669E" w15:done="0"/>
-  <w15:commentEx w15:paraId="40F94984" w15:done="0"/>
-  <w15:commentEx w15:paraId="12CFE427" w15:done="0"/>
+  <w15:commentEx w15:paraId="3F9F0C67" w15:done="1"/>
+  <w15:commentEx w15:paraId="08B900BC" w15:done="1"/>
+  <w15:commentEx w15:paraId="3C7BF8CC" w15:done="1"/>
+  <w15:commentEx w15:paraId="633D4486" w15:done="1"/>
+  <w15:commentEx w15:paraId="5C6591A6" w15:done="1"/>
+  <w15:commentEx w15:paraId="6A0FF1B8" w15:done="1"/>
+  <w15:commentEx w15:paraId="4E187C41" w15:done="1"/>
+  <w15:commentEx w15:paraId="70AA48BA" w15:done="1"/>
+  <w15:commentEx w15:paraId="0747B42C" w15:done="1"/>
+  <w15:commentEx w15:paraId="5951D6CB" w15:done="1"/>
+  <w15:commentEx w15:paraId="5272623C" w15:done="1"/>
+  <w15:commentEx w15:paraId="7537EDD2" w15:done="1"/>
+  <w15:commentEx w15:paraId="1DE8EB26" w15:done="1"/>
+  <w15:commentEx w15:paraId="09C3E246" w15:done="1"/>
+  <w15:commentEx w15:paraId="2DB7669E" w15:done="1"/>
+  <w15:commentEx w15:paraId="40F94984" w15:done="1"/>
+  <w15:commentEx w15:paraId="12CFE427" w15:done="1"/>
   <w15:commentEx w15:paraId="63E15D1F" w15:done="0"/>
-  <w15:commentEx w15:paraId="0ED5443C" w15:done="0"/>
+  <w15:commentEx w15:paraId="0ED5443C" w15:done="1"/>
   <w15:commentEx w15:paraId="5CD8527E" w15:done="0"/>
-  <w15:commentEx w15:paraId="681430EA" w15:done="0"/>
+  <w15:commentEx w15:paraId="681430EA" w15:done="1"/>
   <w15:commentEx w15:paraId="07420C52" w15:done="0"/>
-  <w15:commentEx w15:paraId="3559F115" w15:done="0"/>
+  <w15:commentEx w15:paraId="3559F115" w15:done="1"/>
   <w15:commentEx w15:paraId="55D1D705" w15:done="0"/>
-  <w15:commentEx w15:paraId="17BE2623" w15:done="0"/>
-  <w15:commentEx w15:paraId="429E30CE" w15:done="0"/>
+  <w15:commentEx w15:paraId="7AD5328E" w15:done="0"/>
+  <w15:commentEx w15:paraId="17BE2623" w15:done="1"/>
+  <w15:commentEx w15:paraId="429E30CE" w15:done="1"/>
   <w15:commentEx w15:paraId="6DD215FC" w15:done="0"/>
   <w15:commentEx w15:paraId="7F21EFCC" w15:done="0"/>
   <w15:commentEx w15:paraId="3CDC78AA" w15:done="0"/>
-  <w15:commentEx w15:paraId="7C45D317" w15:done="0"/>
-  <w15:commentEx w15:paraId="46F028C3" w15:done="0"/>
-  <w15:commentEx w15:paraId="3C9025BB" w15:done="0"/>
-  <w15:commentEx w15:paraId="43102174" w15:done="0"/>
-  <w15:commentEx w15:paraId="64101442" w15:done="0"/>
-  <w15:commentEx w15:paraId="64D73A3A" w15:done="0"/>
-  <w15:commentEx w15:paraId="4D6F9CDC" w15:done="0"/>
+  <w15:commentEx w15:paraId="7C45D317" w15:done="1"/>
+  <w15:commentEx w15:paraId="46F028C3" w15:done="1"/>
+  <w15:commentEx w15:paraId="3C9025BB" w15:done="1"/>
+  <w15:commentEx w15:paraId="43102174" w15:done="1"/>
+  <w15:commentEx w15:paraId="64101442" w15:done="1"/>
+  <w15:commentEx w15:paraId="64D73A3A" w15:done="1"/>
+  <w15:commentEx w15:paraId="4D6F9CDC" w15:done="1"/>
   <w15:commentEx w15:paraId="23396962" w15:done="0"/>
-  <w15:commentEx w15:paraId="2466CB2B" w15:done="0"/>
-  <w15:commentEx w15:paraId="14F77C91" w15:done="0"/>
-  <w15:commentEx w15:paraId="74FD3A2C" w15:done="0"/>
-  <w15:commentEx w15:paraId="1167FAA7" w15:done="0"/>
-  <w15:commentEx w15:paraId="6C7ED268" w15:done="0"/>
+  <w15:commentEx w15:paraId="2466CB2B" w15:done="1"/>
+  <w15:commentEx w15:paraId="14F77C91" w15:done="1"/>
+  <w15:commentEx w15:paraId="74FD3A2C" w15:done="1"/>
+  <w15:commentEx w15:paraId="1167FAA7" w15:done="1"/>
+  <w15:commentEx w15:paraId="6C7ED268" w15:done="1"/>
   <w15:commentEx w15:paraId="1B3AF942" w15:done="0"/>
-  <w15:commentEx w15:paraId="3DD6CF64" w15:done="0"/>
-  <w15:commentEx w15:paraId="104072A3" w15:done="0"/>
-  <w15:commentEx w15:paraId="02ADCB51" w15:done="0"/>
+  <w15:commentEx w15:paraId="3DD6CF64" w15:done="1"/>
+  <w15:commentEx w15:paraId="104072A3" w15:done="1"/>
+  <w15:commentEx w15:paraId="02ADCB51" w15:done="1"/>
   <w15:commentEx w15:paraId="20D1B378" w15:done="0"/>
-  <w15:commentEx w15:paraId="6FEE31EE" w15:done="0"/>
-  <w15:commentEx w15:paraId="7518D5BB" w15:done="0"/>
-  <w15:commentEx w15:paraId="54041CE2" w15:done="0"/>
-  <w15:commentEx w15:paraId="5BB86212" w15:done="0"/>
-  <w15:commentEx w15:paraId="06196FAB" w15:done="0"/>
+  <w15:commentEx w15:paraId="6FEE31EE" w15:done="1"/>
+  <w15:commentEx w15:paraId="7518D5BB" w15:done="1"/>
+  <w15:commentEx w15:paraId="54041CE2" w15:done="1"/>
+  <w15:commentEx w15:paraId="5BB86212" w15:done="1"/>
+  <w15:commentEx w15:paraId="06196FAB" w15:done="1"/>
   <w15:commentEx w15:paraId="11357A3C" w15:done="0"/>
   <w15:commentEx w15:paraId="2C43CE4E" w15:done="0"/>
   <w15:commentEx w15:paraId="33DAD0EE" w15:done="0"/>
-  <w15:commentEx w15:paraId="77A9C5F6" w15:done="0"/>
-  <w15:commentEx w15:paraId="4D603B1C" w15:done="0"/>
+  <w15:commentEx w15:paraId="77A9C5F6" w15:done="1"/>
+  <w15:commentEx w15:paraId="4D603B1C" w15:done="1"/>
   <w15:commentEx w15:paraId="16AE505C" w15:done="0"/>
-  <w15:commentEx w15:paraId="20A3F0A7" w15:done="0"/>
-  <w15:commentEx w15:paraId="17F7E3BD" w15:done="0"/>
-  <w15:commentEx w15:paraId="712B5529" w15:done="0"/>
-  <w15:commentEx w15:paraId="113E4465" w15:done="0"/>
-  <w15:commentEx w15:paraId="304F32FC" w15:done="0"/>
-  <w15:commentEx w15:paraId="752EFFCD" w15:done="0"/>
-  <w15:commentEx w15:paraId="726492F2" w15:done="0"/>
-  <w15:commentEx w15:paraId="4452AA08" w15:done="0"/>
-  <w15:commentEx w15:paraId="62C62506" w15:done="0"/>
-  <w15:commentEx w15:paraId="3DA3C36F" w15:done="0"/>
-  <w15:commentEx w15:paraId="73F09D04" w15:done="0"/>
-  <w15:commentEx w15:paraId="2017D9E0" w15:done="0"/>
+  <w15:commentEx w15:paraId="20A3F0A7" w15:done="1"/>
+  <w15:commentEx w15:paraId="17F7E3BD" w15:done="1"/>
+  <w15:commentEx w15:paraId="712B5529" w15:done="1"/>
+  <w15:commentEx w15:paraId="113E4465" w15:done="1"/>
+  <w15:commentEx w15:paraId="304F32FC" w15:done="1"/>
+  <w15:commentEx w15:paraId="752EFFCD" w15:done="1"/>
+  <w15:commentEx w15:paraId="726492F2" w15:done="1"/>
+  <w15:commentEx w15:paraId="4452AA08" w15:done="1"/>
+  <w15:commentEx w15:paraId="62C62506" w15:done="1"/>
+  <w15:commentEx w15:paraId="3DA3C36F" w15:done="1"/>
+  <w15:commentEx w15:paraId="73F09D04" w15:done="1"/>
+  <w15:commentEx w15:paraId="2017D9E0" w15:done="1"/>
   <w15:commentEx w15:paraId="1A03404B" w15:done="0"/>
-  <w15:commentEx w15:paraId="68A79C11" w15:done="0"/>
-  <w15:commentEx w15:paraId="7F267957" w15:done="0"/>
-  <w15:commentEx w15:paraId="43664063" w15:done="0"/>
-  <w15:commentEx w15:paraId="1943EAA2" w15:done="0"/>
-  <w15:commentEx w15:paraId="04D1D50A" w15:done="0"/>
+  <w15:commentEx w15:paraId="68A79C11" w15:done="1"/>
+  <w15:commentEx w15:paraId="7F267957" w15:done="1"/>
+  <w15:commentEx w15:paraId="43664063" w15:done="1"/>
+  <w15:commentEx w15:paraId="1943EAA2" w15:done="1"/>
+  <w15:commentEx w15:paraId="04D1D50A" w15:done="1"/>
   <w15:commentEx w15:paraId="7FF355F1" w15:done="0"/>
-  <w15:commentEx w15:paraId="28155693" w15:done="0"/>
+  <w15:commentEx w15:paraId="28155693" w15:done="1"/>
   <w15:commentEx w15:paraId="09B8B4D4" w15:done="0"/>
-  <w15:commentEx w15:paraId="0D80B923" w15:done="0"/>
-  <w15:commentEx w15:paraId="05795388" w15:done="0"/>
-  <w15:commentEx w15:paraId="0B00CDAA" w15:done="0"/>
-  <w15:commentEx w15:paraId="1C4735BF" w15:done="0"/>
-  <w15:commentEx w15:paraId="4FB216C1" w15:done="0"/>
-  <w15:commentEx w15:paraId="207C29BA" w15:done="0"/>
+  <w15:commentEx w15:paraId="0D80B923" w15:done="1"/>
+  <w15:commentEx w15:paraId="05795388" w15:done="1"/>
+  <w15:commentEx w15:paraId="0B00CDAA" w15:done="1"/>
+  <w15:commentEx w15:paraId="1C4735BF" w15:done="1"/>
+  <w15:commentEx w15:paraId="4FB216C1" w15:done="1"/>
+  <w15:commentEx w15:paraId="207C29BA" w15:done="1"/>
   <w15:commentEx w15:paraId="798D41DB" w15:done="0"/>
-  <w15:commentEx w15:paraId="706B0E24" w15:done="0"/>
-  <w15:commentEx w15:paraId="73263C4A" w15:done="0"/>
+  <w15:commentEx w15:paraId="706B0E24" w15:done="1"/>
+  <w15:commentEx w15:paraId="73263C4A" w15:done="1"/>
 </w15:commentsEx>
 </file>
 
@@ -49403,6 +49493,7 @@
   <w16cex:commentExtensible w16cex:durableId="15D91C4D" w16cex:dateUtc="2026-03-27T11:31:00Z"/>
   <w16cex:commentExtensible w16cex:durableId="51811F4C" w16cex:dateUtc="2026-03-27T11:12:00Z"/>
   <w16cex:commentExtensible w16cex:durableId="55F66F37" w16cex:dateUtc="2026-03-27T14:28:00Z"/>
+  <w16cex:commentExtensible w16cex:durableId="3EF40CF3" w16cex:dateUtc="2026-05-15T15:44:00Z"/>
   <w16cex:commentExtensible w16cex:durableId="679AA952" w16cex:dateUtc="2026-03-30T13:43:00Z"/>
   <w16cex:commentExtensible w16cex:durableId="75385334" w16cex:dateUtc="2026-03-30T15:33:00Z"/>
   <w16cex:commentExtensible w16cex:durableId="754BAE2A" w16cex:dateUtc="2026-03-30T15:33:00Z"/>
@@ -49431,6 +49522,7 @@
   <w16cex:commentExtensible w16cex:durableId="4FDC2FEB" w16cex:dateUtc="2026-04-10T11:32:00Z"/>
   <w16cex:commentExtensible w16cex:durableId="157B68F4" w16cex:dateUtc="2026-03-30T17:59:00Z"/>
   <w16cex:commentExtensible w16cex:durableId="6802E3B6" w16cex:dateUtc="2026-03-30T18:29:00Z"/>
+  <w16cex:commentExtensible w16cex:durableId="22A82B87" w16cex:dateUtc="2026-05-15T15:42:00Z"/>
   <w16cex:commentExtensible w16cex:durableId="052E61E3" w16cex:dateUtc="2026-03-30T18:26:00Z"/>
   <w16cex:commentExtensible w16cex:durableId="6A63C28D" w16cex:dateUtc="2026-03-30T18:29:00Z"/>
   <w16cex:commentExtensible w16cex:durableId="4DD9CA95" w16cex:dateUtc="2026-04-10T11:39:00Z"/>
@@ -49553,6 +49645,7 @@
   <w16cid:commentId w16cid:paraId="01769B50" w16cid:durableId="15D91C4D"/>
   <w16cid:commentId w16cid:paraId="442D4927" w16cid:durableId="51811F4C"/>
   <w16cid:commentId w16cid:paraId="1B057BE2" w16cid:durableId="55F66F37"/>
+  <w16cid:commentId w16cid:paraId="44E47A9D" w16cid:durableId="3EF40CF3"/>
   <w16cid:commentId w16cid:paraId="0260BBC1" w16cid:durableId="679AA952"/>
   <w16cid:commentId w16cid:paraId="4709D2D1" w16cid:durableId="75385334"/>
   <w16cid:commentId w16cid:paraId="69B579A0" w16cid:durableId="754BAE2A"/>
@@ -49581,6 +49674,7 @@
   <w16cid:commentId w16cid:paraId="07420C52" w16cid:durableId="4FDC2FEB"/>
   <w16cid:commentId w16cid:paraId="3559F115" w16cid:durableId="157B68F4"/>
   <w16cid:commentId w16cid:paraId="55D1D705" w16cid:durableId="6802E3B6"/>
+  <w16cid:commentId w16cid:paraId="7AD5328E" w16cid:durableId="22A82B87"/>
   <w16cid:commentId w16cid:paraId="17BE2623" w16cid:durableId="052E61E3"/>
   <w16cid:commentId w16cid:paraId="429E30CE" w16cid:durableId="6A63C28D"/>
   <w16cid:commentId w16cid:paraId="6DD215FC" w16cid:durableId="4DD9CA95"/>
@@ -57780,6 +57874,7 @@
   </w:compat>
   <w:rsids>
     <w:rsidRoot w:val="002B2BCE"/>
+    <w:rsid w:val="00036B29"/>
     <w:rsid w:val="00043749"/>
     <w:rsid w:val="000D7113"/>
     <w:rsid w:val="000E373E"/>
@@ -57838,7 +57933,6 @@
     <w:rsid w:val="00CD6C20"/>
     <w:rsid w:val="00CE1F2F"/>
     <w:rsid w:val="00D05816"/>
-    <w:rsid w:val="00D25296"/>
     <w:rsid w:val="00D7095D"/>
     <w:rsid w:val="00D8221B"/>
     <w:rsid w:val="00DE6C53"/>

</xml_diff>